<commit_message>
Protocolo IF: anticuerpo K2 (NBP1-31423), K10 a 1:100 y márgenes al ~10%
Co-Authored-By: Claude Opus 5.5 <noreply@anthropic.com>
Claude-Session: https://claude.ai/code/session_01Y6a6CQ6f4Dadxpc9Vpo6rH
</commit_message>
<xml_diff>
--- a/protocolos/IF_KerCT_queratinas_ND_D.docx
+++ b/protocolos/IF_KerCT_queratinas_ND_D.docx
@@ -1736,7 +1736,6 @@
               <w:bottom w:val="single" w:color="999999" w:sz="4"/>
               <w:right w:val="single" w:color="999999" w:sz="4"/>
             </w:tcBorders>
-            <w:shd w:fill="FFF2CC" w:color="auto" w:val="clear"/>
             <w:tcMar>
               <w:top w:type="dxa" w:w="60"/>
               <w:left w:type="dxa" w:w="90"/>
@@ -1769,27 +1768,26 @@
               <w:bottom w:val="single" w:color="999999" w:sz="4"/>
               <w:right w:val="single" w:color="999999" w:sz="4"/>
             </w:tcBorders>
-            <w:shd w:fill="FFF2CC" w:color="auto" w:val="clear"/>
-            <w:tcMar>
-              <w:top w:type="dxa" w:w="60"/>
-              <w:left w:type="dxa" w:w="90"/>
-              <w:bottom w:type="dxa" w:w="60"/>
-              <w:right w:type="dxa" w:w="90"/>
-            </w:tcMar>
-          </w:tcPr>
-          <w:p>
-            <w:pPr>
-              <w:jc w:val="center"/>
-            </w:pPr>
-            <w:r>
-              <w:rPr>
-                <w:rFonts w:ascii="Calibri" w:cs="Calibri" w:eastAsia="Calibri" w:hAnsi="Calibri"/>
-                <w:b w:val="false"/>
-                <w:bCs w:val="false"/>
-                <w:sz w:val="20"/>
-                <w:szCs w:val="20"/>
-              </w:rPr>
-              <w:t xml:space="preserve">[COMPLETAR]</w:t>
+            <w:tcMar>
+              <w:top w:type="dxa" w:w="60"/>
+              <w:left w:type="dxa" w:w="90"/>
+              <w:bottom w:type="dxa" w:w="60"/>
+              <w:right w:type="dxa" w:w="90"/>
+            </w:tcMar>
+          </w:tcPr>
+          <w:p>
+            <w:pPr>
+              <w:jc w:val="center"/>
+            </w:pPr>
+            <w:r>
+              <w:rPr>
+                <w:rFonts w:ascii="Calibri" w:cs="Calibri" w:eastAsia="Calibri" w:hAnsi="Calibri"/>
+                <w:b w:val="false"/>
+                <w:bCs w:val="false"/>
+                <w:sz w:val="20"/>
+                <w:szCs w:val="20"/>
+              </w:rPr>
+              <w:t xml:space="preserve">Anti-Cytokeratin 2, Novus NBP1-31423</w:t>
             </w:r>
           </w:p>
         </w:tc>
@@ -1802,27 +1800,26 @@
               <w:bottom w:val="single" w:color="999999" w:sz="4"/>
               <w:right w:val="single" w:color="999999" w:sz="4"/>
             </w:tcBorders>
-            <w:shd w:fill="FFF2CC" w:color="auto" w:val="clear"/>
-            <w:tcMar>
-              <w:top w:type="dxa" w:w="60"/>
-              <w:left w:type="dxa" w:w="90"/>
-              <w:bottom w:type="dxa" w:w="60"/>
-              <w:right w:type="dxa" w:w="90"/>
-            </w:tcMar>
-          </w:tcPr>
-          <w:p>
-            <w:pPr>
-              <w:jc w:val="center"/>
-            </w:pPr>
-            <w:r>
-              <w:rPr>
-                <w:rFonts w:ascii="Calibri" w:cs="Calibri" w:eastAsia="Calibri" w:hAnsi="Calibri"/>
-                <w:b w:val="false"/>
-                <w:bCs w:val="false"/>
-                <w:sz w:val="20"/>
-                <w:szCs w:val="20"/>
-              </w:rPr>
-              <w:t xml:space="preserve">[?]</w:t>
+            <w:tcMar>
+              <w:top w:type="dxa" w:w="60"/>
+              <w:left w:type="dxa" w:w="90"/>
+              <w:bottom w:type="dxa" w:w="60"/>
+              <w:right w:type="dxa" w:w="90"/>
+            </w:tcMar>
+          </w:tcPr>
+          <w:p>
+            <w:pPr>
+              <w:jc w:val="center"/>
+            </w:pPr>
+            <w:r>
+              <w:rPr>
+                <w:rFonts w:ascii="Calibri" w:cs="Calibri" w:eastAsia="Calibri" w:hAnsi="Calibri"/>
+                <w:b w:val="false"/>
+                <w:bCs w:val="false"/>
+                <w:sz w:val="20"/>
+                <w:szCs w:val="20"/>
+              </w:rPr>
+              <w:t xml:space="preserve">Conejo</w:t>
             </w:r>
           </w:p>
         </w:tc>
@@ -1835,27 +1832,26 @@
               <w:bottom w:val="single" w:color="999999" w:sz="4"/>
               <w:right w:val="single" w:color="999999" w:sz="4"/>
             </w:tcBorders>
-            <w:shd w:fill="FFF2CC" w:color="auto" w:val="clear"/>
-            <w:tcMar>
-              <w:top w:type="dxa" w:w="60"/>
-              <w:left w:type="dxa" w:w="90"/>
-              <w:bottom w:type="dxa" w:w="60"/>
-              <w:right w:type="dxa" w:w="90"/>
-            </w:tcMar>
-          </w:tcPr>
-          <w:p>
-            <w:pPr>
-              <w:jc w:val="center"/>
-            </w:pPr>
-            <w:r>
-              <w:rPr>
-                <w:rFonts w:ascii="Calibri" w:cs="Calibri" w:eastAsia="Calibri" w:hAnsi="Calibri"/>
-                <w:b w:val="false"/>
-                <w:bCs w:val="false"/>
-                <w:sz w:val="20"/>
-                <w:szCs w:val="20"/>
-              </w:rPr>
-              <w:t xml:space="preserve">[?]</w:t>
+            <w:tcMar>
+              <w:top w:type="dxa" w:w="60"/>
+              <w:left w:type="dxa" w:w="90"/>
+              <w:bottom w:type="dxa" w:w="60"/>
+              <w:right w:type="dxa" w:w="90"/>
+            </w:tcMar>
+          </w:tcPr>
+          <w:p>
+            <w:pPr>
+              <w:jc w:val="center"/>
+            </w:pPr>
+            <w:r>
+              <w:rPr>
+                <w:rFonts w:ascii="Calibri" w:cs="Calibri" w:eastAsia="Calibri" w:hAnsi="Calibri"/>
+                <w:b w:val="false"/>
+                <w:bCs w:val="false"/>
+                <w:sz w:val="20"/>
+                <w:szCs w:val="20"/>
+              </w:rPr>
+              <w:t xml:space="preserve">1:250</w:t>
             </w:r>
           </w:p>
         </w:tc>
@@ -1868,27 +1864,26 @@
               <w:bottom w:val="single" w:color="999999" w:sz="4"/>
               <w:right w:val="single" w:color="999999" w:sz="4"/>
             </w:tcBorders>
-            <w:shd w:fill="FFF2CC" w:color="auto" w:val="clear"/>
-            <w:tcMar>
-              <w:top w:type="dxa" w:w="60"/>
-              <w:left w:type="dxa" w:w="90"/>
-              <w:bottom w:type="dxa" w:w="60"/>
-              <w:right w:type="dxa" w:w="90"/>
-            </w:tcMar>
-          </w:tcPr>
-          <w:p>
-            <w:pPr>
-              <w:jc w:val="center"/>
-            </w:pPr>
-            <w:r>
-              <w:rPr>
-                <w:rFonts w:ascii="Calibri" w:cs="Calibri" w:eastAsia="Calibri" w:hAnsi="Calibri"/>
-                <w:b w:val="false"/>
-                <w:bCs w:val="false"/>
-                <w:sz w:val="20"/>
-                <w:szCs w:val="20"/>
-              </w:rPr>
-              <w:t xml:space="preserve">Según especie</w:t>
+            <w:tcMar>
+              <w:top w:type="dxa" w:w="60"/>
+              <w:left w:type="dxa" w:w="90"/>
+              <w:bottom w:type="dxa" w:w="60"/>
+              <w:right w:type="dxa" w:w="90"/>
+            </w:tcMar>
+          </w:tcPr>
+          <w:p>
+            <w:pPr>
+              <w:jc w:val="center"/>
+            </w:pPr>
+            <w:r>
+              <w:rPr>
+                <w:rFonts w:ascii="Calibri" w:cs="Calibri" w:eastAsia="Calibri" w:hAnsi="Calibri"/>
+                <w:b w:val="false"/>
+                <w:bCs w:val="false"/>
+                <w:sz w:val="20"/>
+                <w:szCs w:val="20"/>
+              </w:rPr>
+              <w:t xml:space="preserve">Anti-rabbit 488</w:t>
             </w:r>
           </w:p>
         </w:tc>
@@ -1901,27 +1896,26 @@
               <w:bottom w:val="single" w:color="999999" w:sz="4"/>
               <w:right w:val="single" w:color="999999" w:sz="4"/>
             </w:tcBorders>
-            <w:shd w:fill="FFF2CC" w:color="auto" w:val="clear"/>
-            <w:tcMar>
-              <w:top w:type="dxa" w:w="60"/>
-              <w:left w:type="dxa" w:w="90"/>
-              <w:bottom w:type="dxa" w:w="60"/>
-              <w:right w:type="dxa" w:w="90"/>
-            </w:tcMar>
-          </w:tcPr>
-          <w:p>
-            <w:pPr>
-              <w:jc w:val="center"/>
-            </w:pPr>
-            <w:r>
-              <w:rPr>
-                <w:rFonts w:ascii="Calibri" w:cs="Calibri" w:eastAsia="Calibri" w:hAnsi="Calibri"/>
-                <w:b w:val="false"/>
-                <w:bCs w:val="false"/>
-                <w:sz w:val="20"/>
-                <w:szCs w:val="20"/>
-              </w:rPr>
-              <w:t xml:space="preserve">No está en el TFG</w:t>
+            <w:tcMar>
+              <w:top w:type="dxa" w:w="60"/>
+              <w:left w:type="dxa" w:w="90"/>
+              <w:bottom w:type="dxa" w:w="60"/>
+              <w:right w:type="dxa" w:w="90"/>
+            </w:tcMar>
+          </w:tcPr>
+          <w:p>
+            <w:pPr>
+              <w:jc w:val="center"/>
+            </w:pPr>
+            <w:r>
+              <w:rPr>
+                <w:rFonts w:ascii="Calibri" w:cs="Calibri" w:eastAsia="Calibri" w:hAnsi="Calibri"/>
+                <w:b w:val="false"/>
+                <w:bCs w:val="false"/>
+                <w:sz w:val="20"/>
+                <w:szCs w:val="20"/>
+              </w:rPr>
+              <w:t xml:space="preserve">Datasheet: ICC/IF 1:100-1:1000</w:t>
             </w:r>
           </w:p>
         </w:tc>
@@ -2439,7 +2433,7 @@
                 <w:sz w:val="20"/>
                 <w:szCs w:val="20"/>
               </w:rPr>
-              <w:t xml:space="preserve">1:200</w:t>
+              <w:t xml:space="preserve">1:100</w:t>
             </w:r>
           </w:p>
         </w:tc>
@@ -2503,7 +2497,7 @@
                 <w:sz w:val="20"/>
                 <w:szCs w:val="20"/>
               </w:rPr>
-              <w:t xml:space="preserve">Protocolo original</w:t>
+              <w:t xml:space="preserve">Protocolo original (allí a 1:200)</w:t>
             </w:r>
           </w:p>
         </w:tc>
@@ -2791,7 +2785,7 @@
                 <w:sz w:val="20"/>
                 <w:szCs w:val="20"/>
               </w:rPr>
-              <w:t xml:space="preserve">K1, K5, K14 (+K2 si es de conejo), C- rabbit</w:t>
+              <w:t xml:space="preserve">K1, K2, K5, K14, C- rabbit</w:t>
             </w:r>
           </w:p>
         </w:tc>
@@ -2921,7 +2915,7 @@
                 <w:sz w:val="20"/>
                 <w:szCs w:val="20"/>
               </w:rPr>
-              <w:t xml:space="preserve">K10 (+K2 si es de ratón), C- mouse</w:t>
+              <w:t xml:space="preserve">K10, C- mouse</w:t>
             </w:r>
           </w:p>
         </w:tc>
@@ -2948,7 +2942,26 @@
           <w:sz w:val="22"/>
           <w:szCs w:val="22"/>
         </w:rPr>
-        <w:t xml:space="preserve">OJO K2: en el TFG de Pablo no hay anticuerpo de K2 (solo K1, K5, K10 y K14). Hay que buscar cuál tenemos y completar especie y dilución. Más abajo tienes los cálculos ya hechos para las diluciones más habituales.</w:t>
+        <w:t xml:space="preserve">K2 (NBP1-31423, policlonal de conejo): no está en el TFG. El fabricante da 1:100-1:1000 para ICC/IF; se usa 1:250 (como K14), tirando a concentrado porque K2 es de diferenciación tardía y puede estar baja. Si da mucho fondo, probar 1:500. La concentración varía por lote: mirar la etiqueta del vial.</w:t>
+      </w:r>
+    </w:p>
+    <w:p>
+      <w:pPr>
+        <w:pBdr>
+          <w:left w:val="single" w:color="E0A040" w:sz="12" w:space="6"/>
+        </w:pBdr>
+        <w:spacing w:after="100"/>
+      </w:pPr>
+      <w:r>
+        <w:rPr>
+          <w:rFonts w:ascii="Calibri" w:cs="Calibri" w:eastAsia="Calibri" w:hAnsi="Calibri"/>
+          <w:i/>
+          <w:iCs/>
+          <w:color w:val="7F3F00"/>
+          <w:sz w:val="22"/>
+          <w:szCs w:val="22"/>
+        </w:rPr>
+        <w:t xml:space="preserve">K10 (DE-K10, ratón): en el protocolo original estaba a 1:200; aquí se sube a 1:100.</w:t>
       </w:r>
     </w:p>
     <w:p>
@@ -3790,7 +3803,7 @@
                 <w:sz w:val="20"/>
                 <w:szCs w:val="20"/>
               </w:rPr>
-              <w:t xml:space="preserve">~0,95 mL en total</w:t>
+              <w:t xml:space="preserve">~0,9 mL en total</w:t>
             </w:r>
           </w:p>
         </w:tc>
@@ -3888,7 +3901,7 @@
                 <w:sz w:val="20"/>
                 <w:szCs w:val="20"/>
               </w:rPr>
-              <w:t xml:space="preserve">~0,9-1 mL en total</w:t>
+              <w:t xml:space="preserve">~0,9 mL en total</w:t>
             </w:r>
           </w:p>
         </w:tc>
@@ -4422,7 +4435,7 @@
           <w:sz w:val="22"/>
           <w:szCs w:val="22"/>
         </w:rPr>
-        <w:t xml:space="preserve">Se prepara volumen para los cristales + margen (~1 cristal extra). Cuando el volumen de anticuerpo saldría &lt; 0,5 µL, se sube el volumen total para poder pipetearlo bien (pipeta P2).</w:t>
+        <w:t xml:space="preserve">Volumen = nº cristales × 30 µL + ~10% de margen. Excepción: si con el 10% el anticuerpo saldría &lt; 0,5 µL (no se pipetea con precisión con la P2), se sube el volumen total hasta que el anticuerpo sea 0,5 µL; en esos casos el margen es mayor (columna «Margen real»).</w:t>
       </w:r>
     </w:p>
     <w:tbl>
@@ -4438,17 +4451,18 @@
         </w:tblBorders>
       </w:tblPr>
       <w:tblGrid>
-        <w:gridCol w:w="1400"/>
-        <w:gridCol w:w="1000"/>
-        <w:gridCol w:w="1400"/>
-        <w:gridCol w:w="1400"/>
-        <w:gridCol w:w="1900"/>
-        <w:gridCol w:w="2538"/>
+        <w:gridCol w:w="1300"/>
+        <w:gridCol w:w="900"/>
+        <w:gridCol w:w="1200"/>
+        <w:gridCol w:w="1300"/>
+        <w:gridCol w:w="1300"/>
+        <w:gridCol w:w="1600"/>
+        <w:gridCol w:w="2038"/>
       </w:tblGrid>
       <w:tr>
         <w:tc>
           <w:tcPr>
-            <w:tcW w:type="dxa" w:w="1400"/>
+            <w:tcW w:type="dxa" w:w="1300"/>
             <w:tcBorders>
               <w:top w:val="single" w:color="999999" w:sz="4"/>
               <w:left w:val="single" w:color="999999" w:sz="4"/>
@@ -4481,7 +4495,7 @@
         </w:tc>
         <w:tc>
           <w:tcPr>
-            <w:tcW w:type="dxa" w:w="1000"/>
+            <w:tcW w:type="dxa" w:w="900"/>
             <w:tcBorders>
               <w:top w:val="single" w:color="999999" w:sz="4"/>
               <w:left w:val="single" w:color="999999" w:sz="4"/>
@@ -4514,7 +4528,7 @@
         </w:tc>
         <w:tc>
           <w:tcPr>
-            <w:tcW w:type="dxa" w:w="1400"/>
+            <w:tcW w:type="dxa" w:w="1200"/>
             <w:tcBorders>
               <w:top w:val="single" w:color="999999" w:sz="4"/>
               <w:left w:val="single" w:color="999999" w:sz="4"/>
@@ -4547,7 +4561,7 @@
         </w:tc>
         <w:tc>
           <w:tcPr>
-            <w:tcW w:type="dxa" w:w="1400"/>
+            <w:tcW w:type="dxa" w:w="1300"/>
             <w:tcBorders>
               <w:top w:val="single" w:color="999999" w:sz="4"/>
               <w:left w:val="single" w:color="999999" w:sz="4"/>
@@ -4574,13 +4588,13 @@
                 <w:sz w:val="20"/>
                 <w:szCs w:val="20"/>
               </w:rPr>
-              <w:t xml:space="preserve">Volumen a preparar</w:t>
-            </w:r>
-          </w:p>
-        </w:tc>
-        <w:tc>
-          <w:tcPr>
-            <w:tcW w:type="dxa" w:w="1900"/>
+              <w:t xml:space="preserve">Necesario (n×30 µL)</w:t>
+            </w:r>
+          </w:p>
+        </w:tc>
+        <w:tc>
+          <w:tcPr>
+            <w:tcW w:type="dxa" w:w="1300"/>
             <w:tcBorders>
               <w:top w:val="single" w:color="999999" w:sz="4"/>
               <w:left w:val="single" w:color="999999" w:sz="4"/>
@@ -4607,13 +4621,13 @@
                 <w:sz w:val="20"/>
                 <w:szCs w:val="20"/>
               </w:rPr>
-              <w:t xml:space="preserve">Anticuerpo</w:t>
-            </w:r>
-          </w:p>
-        </w:tc>
-        <w:tc>
-          <w:tcPr>
-            <w:tcW w:type="dxa" w:w="2538"/>
+              <w:t xml:space="preserve">Volumen a preparar</w:t>
+            </w:r>
+          </w:p>
+        </w:tc>
+        <w:tc>
+          <w:tcPr>
+            <w:tcW w:type="dxa" w:w="1600"/>
             <w:tcBorders>
               <w:top w:val="single" w:color="999999" w:sz="4"/>
               <w:left w:val="single" w:color="999999" w:sz="4"/>
@@ -4640,7 +4654,40 @@
                 <w:sz w:val="20"/>
                 <w:szCs w:val="20"/>
               </w:rPr>
-              <w:t xml:space="preserve">BSA 3%</w:t>
+              <w:t xml:space="preserve">Anticuerpo + BSA 3%</w:t>
+            </w:r>
+          </w:p>
+        </w:tc>
+        <w:tc>
+          <w:tcPr>
+            <w:tcW w:type="dxa" w:w="2038"/>
+            <w:tcBorders>
+              <w:top w:val="single" w:color="999999" w:sz="4"/>
+              <w:left w:val="single" w:color="999999" w:sz="4"/>
+              <w:bottom w:val="single" w:color="999999" w:sz="4"/>
+              <w:right w:val="single" w:color="999999" w:sz="4"/>
+            </w:tcBorders>
+            <w:shd w:fill="D9E2F3" w:color="auto" w:val="clear"/>
+            <w:tcMar>
+              <w:top w:type="dxa" w:w="60"/>
+              <w:left w:type="dxa" w:w="90"/>
+              <w:bottom w:type="dxa" w:w="60"/>
+              <w:right w:type="dxa" w:w="90"/>
+            </w:tcMar>
+          </w:tcPr>
+          <w:p>
+            <w:pPr>
+              <w:jc w:val="center"/>
+            </w:pPr>
+            <w:r>
+              <w:rPr>
+                <w:rFonts w:ascii="Calibri" w:cs="Calibri" w:eastAsia="Calibri" w:hAnsi="Calibri"/>
+                <w:b/>
+                <w:bCs/>
+                <w:sz w:val="20"/>
+                <w:szCs w:val="20"/>
+              </w:rPr>
+              <w:t xml:space="preserve">Margen real</w:t>
             </w:r>
           </w:p>
         </w:tc>
@@ -4648,7 +4695,7 @@
       <w:tr>
         <w:tc>
           <w:tcPr>
-            <w:tcW w:type="dxa" w:w="1400"/>
+            <w:tcW w:type="dxa" w:w="1300"/>
             <w:tcBorders>
               <w:top w:val="single" w:color="999999" w:sz="4"/>
               <w:left w:val="single" w:color="999999" w:sz="4"/>
@@ -4680,7 +4727,7 @@
         </w:tc>
         <w:tc>
           <w:tcPr>
-            <w:tcW w:type="dxa" w:w="1000"/>
+            <w:tcW w:type="dxa" w:w="900"/>
             <w:tcBorders>
               <w:top w:val="single" w:color="999999" w:sz="4"/>
               <w:left w:val="single" w:color="999999" w:sz="4"/>
@@ -4712,7 +4759,7 @@
         </w:tc>
         <w:tc>
           <w:tcPr>
-            <w:tcW w:type="dxa" w:w="1400"/>
+            <w:tcW w:type="dxa" w:w="1200"/>
             <w:tcBorders>
               <w:top w:val="single" w:color="999999" w:sz="4"/>
               <w:left w:val="single" w:color="999999" w:sz="4"/>
@@ -4744,7 +4791,39 @@
         </w:tc>
         <w:tc>
           <w:tcPr>
-            <w:tcW w:type="dxa" w:w="1400"/>
+            <w:tcW w:type="dxa" w:w="1300"/>
+            <w:tcBorders>
+              <w:top w:val="single" w:color="999999" w:sz="4"/>
+              <w:left w:val="single" w:color="999999" w:sz="4"/>
+              <w:bottom w:val="single" w:color="999999" w:sz="4"/>
+              <w:right w:val="single" w:color="999999" w:sz="4"/>
+            </w:tcBorders>
+            <w:tcMar>
+              <w:top w:type="dxa" w:w="60"/>
+              <w:left w:type="dxa" w:w="90"/>
+              <w:bottom w:type="dxa" w:w="60"/>
+              <w:right w:type="dxa" w:w="90"/>
+            </w:tcMar>
+          </w:tcPr>
+          <w:p>
+            <w:pPr>
+              <w:jc w:val="center"/>
+            </w:pPr>
+            <w:r>
+              <w:rPr>
+                <w:rFonts w:ascii="Calibri" w:cs="Calibri" w:eastAsia="Calibri" w:hAnsi="Calibri"/>
+                <w:b w:val="false"/>
+                <w:bCs w:val="false"/>
+                <w:sz w:val="20"/>
+                <w:szCs w:val="20"/>
+              </w:rPr>
+              <w:t xml:space="preserve">120 µL</w:t>
+            </w:r>
+          </w:p>
+        </w:tc>
+        <w:tc>
+          <w:tcPr>
+            <w:tcW w:type="dxa" w:w="1300"/>
             <w:tcBorders>
               <w:top w:val="single" w:color="999999" w:sz="4"/>
               <w:left w:val="single" w:color="999999" w:sz="4"/>
@@ -4776,65 +4855,65 @@
         </w:tc>
         <w:tc>
           <w:tcPr>
-            <w:tcW w:type="dxa" w:w="1900"/>
-            <w:tcBorders>
-              <w:top w:val="single" w:color="999999" w:sz="4"/>
-              <w:left w:val="single" w:color="999999" w:sz="4"/>
-              <w:bottom w:val="single" w:color="999999" w:sz="4"/>
-              <w:right w:val="single" w:color="999999" w:sz="4"/>
-            </w:tcBorders>
-            <w:tcMar>
-              <w:top w:type="dxa" w:w="60"/>
-              <w:left w:type="dxa" w:w="90"/>
-              <w:bottom w:type="dxa" w:w="60"/>
-              <w:right w:type="dxa" w:w="90"/>
-            </w:tcMar>
-          </w:tcPr>
-          <w:p>
-            <w:pPr>
-              <w:jc w:val="center"/>
-            </w:pPr>
-            <w:r>
-              <w:rPr>
-                <w:rFonts w:ascii="Calibri" w:cs="Calibri" w:eastAsia="Calibri" w:hAnsi="Calibri"/>
-                <w:b w:val="false"/>
-                <w:bCs w:val="false"/>
-                <w:sz w:val="20"/>
-                <w:szCs w:val="20"/>
-              </w:rPr>
-              <w:t xml:space="preserve">0,5 µL</w:t>
-            </w:r>
-          </w:p>
-        </w:tc>
-        <w:tc>
-          <w:tcPr>
-            <w:tcW w:type="dxa" w:w="2538"/>
-            <w:tcBorders>
-              <w:top w:val="single" w:color="999999" w:sz="4"/>
-              <w:left w:val="single" w:color="999999" w:sz="4"/>
-              <w:bottom w:val="single" w:color="999999" w:sz="4"/>
-              <w:right w:val="single" w:color="999999" w:sz="4"/>
-            </w:tcBorders>
-            <w:tcMar>
-              <w:top w:type="dxa" w:w="60"/>
-              <w:left w:type="dxa" w:w="90"/>
-              <w:bottom w:type="dxa" w:w="60"/>
-              <w:right w:type="dxa" w:w="90"/>
-            </w:tcMar>
-          </w:tcPr>
-          <w:p>
-            <w:pPr>
-              <w:jc w:val="center"/>
-            </w:pPr>
-            <w:r>
-              <w:rPr>
-                <w:rFonts w:ascii="Calibri" w:cs="Calibri" w:eastAsia="Calibri" w:hAnsi="Calibri"/>
-                <w:b w:val="false"/>
-                <w:bCs w:val="false"/>
-                <w:sz w:val="20"/>
-                <w:szCs w:val="20"/>
-              </w:rPr>
-              <w:t xml:space="preserve">249,5 µL</w:t>
+            <w:tcW w:type="dxa" w:w="1600"/>
+            <w:tcBorders>
+              <w:top w:val="single" w:color="999999" w:sz="4"/>
+              <w:left w:val="single" w:color="999999" w:sz="4"/>
+              <w:bottom w:val="single" w:color="999999" w:sz="4"/>
+              <w:right w:val="single" w:color="999999" w:sz="4"/>
+            </w:tcBorders>
+            <w:tcMar>
+              <w:top w:type="dxa" w:w="60"/>
+              <w:left w:type="dxa" w:w="90"/>
+              <w:bottom w:type="dxa" w:w="60"/>
+              <w:right w:type="dxa" w:w="90"/>
+            </w:tcMar>
+          </w:tcPr>
+          <w:p>
+            <w:pPr>
+              <w:jc w:val="center"/>
+            </w:pPr>
+            <w:r>
+              <w:rPr>
+                <w:rFonts w:ascii="Calibri" w:cs="Calibri" w:eastAsia="Calibri" w:hAnsi="Calibri"/>
+                <w:b w:val="false"/>
+                <w:bCs w:val="false"/>
+                <w:sz w:val="20"/>
+                <w:szCs w:val="20"/>
+              </w:rPr>
+              <w:t xml:space="preserve">0,5 µL + 249,5 µL</w:t>
+            </w:r>
+          </w:p>
+        </w:tc>
+        <w:tc>
+          <w:tcPr>
+            <w:tcW w:type="dxa" w:w="2038"/>
+            <w:tcBorders>
+              <w:top w:val="single" w:color="999999" w:sz="4"/>
+              <w:left w:val="single" w:color="999999" w:sz="4"/>
+              <w:bottom w:val="single" w:color="999999" w:sz="4"/>
+              <w:right w:val="single" w:color="999999" w:sz="4"/>
+            </w:tcBorders>
+            <w:tcMar>
+              <w:top w:type="dxa" w:w="60"/>
+              <w:left w:type="dxa" w:w="90"/>
+              <w:bottom w:type="dxa" w:w="60"/>
+              <w:right w:type="dxa" w:w="90"/>
+            </w:tcMar>
+          </w:tcPr>
+          <w:p>
+            <w:pPr>
+              <w:jc w:val="center"/>
+            </w:pPr>
+            <w:r>
+              <w:rPr>
+                <w:rFonts w:ascii="Calibri" w:cs="Calibri" w:eastAsia="Calibri" w:hAnsi="Calibri"/>
+                <w:b w:val="false"/>
+                <w:bCs w:val="false"/>
+                <w:sz w:val="20"/>
+                <w:szCs w:val="20"/>
+              </w:rPr>
+              <w:t xml:space="preserve">+108% (mín. pipeteo 0,5 µL)</w:t>
             </w:r>
           </w:p>
         </w:tc>
@@ -4842,71 +4921,71 @@
       <w:tr>
         <w:tc>
           <w:tcPr>
-            <w:tcW w:type="dxa" w:w="1400"/>
-            <w:tcBorders>
-              <w:top w:val="single" w:color="999999" w:sz="4"/>
-              <w:left w:val="single" w:color="999999" w:sz="4"/>
-              <w:bottom w:val="single" w:color="999999" w:sz="4"/>
-              <w:right w:val="single" w:color="999999" w:sz="4"/>
-            </w:tcBorders>
-            <w:tcMar>
-              <w:top w:type="dxa" w:w="60"/>
-              <w:left w:type="dxa" w:w="90"/>
-              <w:bottom w:type="dxa" w:w="60"/>
-              <w:right w:type="dxa" w:w="90"/>
-            </w:tcMar>
-          </w:tcPr>
-          <w:p>
-            <w:pPr>
-              <w:jc w:val="center"/>
-            </w:pPr>
-            <w:r>
-              <w:rPr>
-                <w:rFonts w:ascii="Calibri" w:cs="Calibri" w:eastAsia="Calibri" w:hAnsi="Calibri"/>
-                <w:b w:val="false"/>
-                <w:bCs w:val="false"/>
-                <w:sz w:val="20"/>
-                <w:szCs w:val="20"/>
-              </w:rPr>
-              <w:t xml:space="preserve">K5 (rabbit)</w:t>
-            </w:r>
-          </w:p>
-        </w:tc>
-        <w:tc>
-          <w:tcPr>
-            <w:tcW w:type="dxa" w:w="1000"/>
-            <w:tcBorders>
-              <w:top w:val="single" w:color="999999" w:sz="4"/>
-              <w:left w:val="single" w:color="999999" w:sz="4"/>
-              <w:bottom w:val="single" w:color="999999" w:sz="4"/>
-              <w:right w:val="single" w:color="999999" w:sz="4"/>
-            </w:tcBorders>
-            <w:tcMar>
-              <w:top w:type="dxa" w:w="60"/>
-              <w:left w:type="dxa" w:w="90"/>
-              <w:bottom w:type="dxa" w:w="60"/>
-              <w:right w:type="dxa" w:w="90"/>
-            </w:tcMar>
-          </w:tcPr>
-          <w:p>
-            <w:pPr>
-              <w:jc w:val="center"/>
-            </w:pPr>
-            <w:r>
-              <w:rPr>
-                <w:rFonts w:ascii="Calibri" w:cs="Calibri" w:eastAsia="Calibri" w:hAnsi="Calibri"/>
-                <w:b w:val="false"/>
-                <w:bCs w:val="false"/>
-                <w:sz w:val="20"/>
-                <w:szCs w:val="20"/>
-              </w:rPr>
-              <w:t xml:space="preserve">1:300</w:t>
-            </w:r>
-          </w:p>
-        </w:tc>
-        <w:tc>
-          <w:tcPr>
-            <w:tcW w:type="dxa" w:w="1400"/>
+            <w:tcW w:type="dxa" w:w="1300"/>
+            <w:tcBorders>
+              <w:top w:val="single" w:color="999999" w:sz="4"/>
+              <w:left w:val="single" w:color="999999" w:sz="4"/>
+              <w:bottom w:val="single" w:color="999999" w:sz="4"/>
+              <w:right w:val="single" w:color="999999" w:sz="4"/>
+            </w:tcBorders>
+            <w:tcMar>
+              <w:top w:type="dxa" w:w="60"/>
+              <w:left w:type="dxa" w:w="90"/>
+              <w:bottom w:type="dxa" w:w="60"/>
+              <w:right w:type="dxa" w:w="90"/>
+            </w:tcMar>
+          </w:tcPr>
+          <w:p>
+            <w:pPr>
+              <w:jc w:val="center"/>
+            </w:pPr>
+            <w:r>
+              <w:rPr>
+                <w:rFonts w:ascii="Calibri" w:cs="Calibri" w:eastAsia="Calibri" w:hAnsi="Calibri"/>
+                <w:b w:val="false"/>
+                <w:bCs w:val="false"/>
+                <w:sz w:val="20"/>
+                <w:szCs w:val="20"/>
+              </w:rPr>
+              <w:t xml:space="preserve">K2 (rabbit)</w:t>
+            </w:r>
+          </w:p>
+        </w:tc>
+        <w:tc>
+          <w:tcPr>
+            <w:tcW w:type="dxa" w:w="900"/>
+            <w:tcBorders>
+              <w:top w:val="single" w:color="999999" w:sz="4"/>
+              <w:left w:val="single" w:color="999999" w:sz="4"/>
+              <w:bottom w:val="single" w:color="999999" w:sz="4"/>
+              <w:right w:val="single" w:color="999999" w:sz="4"/>
+            </w:tcBorders>
+            <w:tcMar>
+              <w:top w:type="dxa" w:w="60"/>
+              <w:left w:type="dxa" w:w="90"/>
+              <w:bottom w:type="dxa" w:w="60"/>
+              <w:right w:type="dxa" w:w="90"/>
+            </w:tcMar>
+          </w:tcPr>
+          <w:p>
+            <w:pPr>
+              <w:jc w:val="center"/>
+            </w:pPr>
+            <w:r>
+              <w:rPr>
+                <w:rFonts w:ascii="Calibri" w:cs="Calibri" w:eastAsia="Calibri" w:hAnsi="Calibri"/>
+                <w:b w:val="false"/>
+                <w:bCs w:val="false"/>
+                <w:sz w:val="20"/>
+                <w:szCs w:val="20"/>
+              </w:rPr>
+              <w:t xml:space="preserve">1:250</w:t>
+            </w:r>
+          </w:p>
+        </w:tc>
+        <w:tc>
+          <w:tcPr>
+            <w:tcW w:type="dxa" w:w="1200"/>
             <w:tcBorders>
               <w:top w:val="single" w:color="999999" w:sz="4"/>
               <w:left w:val="single" w:color="999999" w:sz="4"/>
@@ -4938,97 +5017,129 @@
         </w:tc>
         <w:tc>
           <w:tcPr>
-            <w:tcW w:type="dxa" w:w="1400"/>
-            <w:tcBorders>
-              <w:top w:val="single" w:color="999999" w:sz="4"/>
-              <w:left w:val="single" w:color="999999" w:sz="4"/>
-              <w:bottom w:val="single" w:color="999999" w:sz="4"/>
-              <w:right w:val="single" w:color="999999" w:sz="4"/>
-            </w:tcBorders>
-            <w:tcMar>
-              <w:top w:type="dxa" w:w="60"/>
-              <w:left w:type="dxa" w:w="90"/>
-              <w:bottom w:type="dxa" w:w="60"/>
-              <w:right w:type="dxa" w:w="90"/>
-            </w:tcMar>
-          </w:tcPr>
-          <w:p>
-            <w:pPr>
-              <w:jc w:val="center"/>
-            </w:pPr>
-            <w:r>
-              <w:rPr>
-                <w:rFonts w:ascii="Calibri" w:cs="Calibri" w:eastAsia="Calibri" w:hAnsi="Calibri"/>
-                <w:b w:val="false"/>
-                <w:bCs w:val="false"/>
-                <w:sz w:val="20"/>
-                <w:szCs w:val="20"/>
-              </w:rPr>
-              <w:t xml:space="preserve">150 µL</w:t>
-            </w:r>
-          </w:p>
-        </w:tc>
-        <w:tc>
-          <w:tcPr>
-            <w:tcW w:type="dxa" w:w="1900"/>
-            <w:tcBorders>
-              <w:top w:val="single" w:color="999999" w:sz="4"/>
-              <w:left w:val="single" w:color="999999" w:sz="4"/>
-              <w:bottom w:val="single" w:color="999999" w:sz="4"/>
-              <w:right w:val="single" w:color="999999" w:sz="4"/>
-            </w:tcBorders>
-            <w:tcMar>
-              <w:top w:type="dxa" w:w="60"/>
-              <w:left w:type="dxa" w:w="90"/>
-              <w:bottom w:type="dxa" w:w="60"/>
-              <w:right w:type="dxa" w:w="90"/>
-            </w:tcMar>
-          </w:tcPr>
-          <w:p>
-            <w:pPr>
-              <w:jc w:val="center"/>
-            </w:pPr>
-            <w:r>
-              <w:rPr>
-                <w:rFonts w:ascii="Calibri" w:cs="Calibri" w:eastAsia="Calibri" w:hAnsi="Calibri"/>
-                <w:b w:val="false"/>
-                <w:bCs w:val="false"/>
-                <w:sz w:val="20"/>
-                <w:szCs w:val="20"/>
-              </w:rPr>
-              <w:t xml:space="preserve">0,5 µL</w:t>
-            </w:r>
-          </w:p>
-        </w:tc>
-        <w:tc>
-          <w:tcPr>
-            <w:tcW w:type="dxa" w:w="2538"/>
-            <w:tcBorders>
-              <w:top w:val="single" w:color="999999" w:sz="4"/>
-              <w:left w:val="single" w:color="999999" w:sz="4"/>
-              <w:bottom w:val="single" w:color="999999" w:sz="4"/>
-              <w:right w:val="single" w:color="999999" w:sz="4"/>
-            </w:tcBorders>
-            <w:tcMar>
-              <w:top w:type="dxa" w:w="60"/>
-              <w:left w:type="dxa" w:w="90"/>
-              <w:bottom w:type="dxa" w:w="60"/>
-              <w:right w:type="dxa" w:w="90"/>
-            </w:tcMar>
-          </w:tcPr>
-          <w:p>
-            <w:pPr>
-              <w:jc w:val="center"/>
-            </w:pPr>
-            <w:r>
-              <w:rPr>
-                <w:rFonts w:ascii="Calibri" w:cs="Calibri" w:eastAsia="Calibri" w:hAnsi="Calibri"/>
-                <w:b w:val="false"/>
-                <w:bCs w:val="false"/>
-                <w:sz w:val="20"/>
-                <w:szCs w:val="20"/>
-              </w:rPr>
-              <w:t xml:space="preserve">149,5 µL</w:t>
+            <w:tcW w:type="dxa" w:w="1300"/>
+            <w:tcBorders>
+              <w:top w:val="single" w:color="999999" w:sz="4"/>
+              <w:left w:val="single" w:color="999999" w:sz="4"/>
+              <w:bottom w:val="single" w:color="999999" w:sz="4"/>
+              <w:right w:val="single" w:color="999999" w:sz="4"/>
+            </w:tcBorders>
+            <w:tcMar>
+              <w:top w:type="dxa" w:w="60"/>
+              <w:left w:type="dxa" w:w="90"/>
+              <w:bottom w:type="dxa" w:w="60"/>
+              <w:right w:type="dxa" w:w="90"/>
+            </w:tcMar>
+          </w:tcPr>
+          <w:p>
+            <w:pPr>
+              <w:jc w:val="center"/>
+            </w:pPr>
+            <w:r>
+              <w:rPr>
+                <w:rFonts w:ascii="Calibri" w:cs="Calibri" w:eastAsia="Calibri" w:hAnsi="Calibri"/>
+                <w:b w:val="false"/>
+                <w:bCs w:val="false"/>
+                <w:sz w:val="20"/>
+                <w:szCs w:val="20"/>
+              </w:rPr>
+              <w:t xml:space="preserve">120 µL</w:t>
+            </w:r>
+          </w:p>
+        </w:tc>
+        <w:tc>
+          <w:tcPr>
+            <w:tcW w:type="dxa" w:w="1300"/>
+            <w:tcBorders>
+              <w:top w:val="single" w:color="999999" w:sz="4"/>
+              <w:left w:val="single" w:color="999999" w:sz="4"/>
+              <w:bottom w:val="single" w:color="999999" w:sz="4"/>
+              <w:right w:val="single" w:color="999999" w:sz="4"/>
+            </w:tcBorders>
+            <w:tcMar>
+              <w:top w:type="dxa" w:w="60"/>
+              <w:left w:type="dxa" w:w="90"/>
+              <w:bottom w:type="dxa" w:w="60"/>
+              <w:right w:type="dxa" w:w="90"/>
+            </w:tcMar>
+          </w:tcPr>
+          <w:p>
+            <w:pPr>
+              <w:jc w:val="center"/>
+            </w:pPr>
+            <w:r>
+              <w:rPr>
+                <w:rFonts w:ascii="Calibri" w:cs="Calibri" w:eastAsia="Calibri" w:hAnsi="Calibri"/>
+                <w:b w:val="false"/>
+                <w:bCs w:val="false"/>
+                <w:sz w:val="20"/>
+                <w:szCs w:val="20"/>
+              </w:rPr>
+              <w:t xml:space="preserve">135 µL</w:t>
+            </w:r>
+          </w:p>
+        </w:tc>
+        <w:tc>
+          <w:tcPr>
+            <w:tcW w:type="dxa" w:w="1600"/>
+            <w:tcBorders>
+              <w:top w:val="single" w:color="999999" w:sz="4"/>
+              <w:left w:val="single" w:color="999999" w:sz="4"/>
+              <w:bottom w:val="single" w:color="999999" w:sz="4"/>
+              <w:right w:val="single" w:color="999999" w:sz="4"/>
+            </w:tcBorders>
+            <w:tcMar>
+              <w:top w:type="dxa" w:w="60"/>
+              <w:left w:type="dxa" w:w="90"/>
+              <w:bottom w:type="dxa" w:w="60"/>
+              <w:right w:type="dxa" w:w="90"/>
+            </w:tcMar>
+          </w:tcPr>
+          <w:p>
+            <w:pPr>
+              <w:jc w:val="center"/>
+            </w:pPr>
+            <w:r>
+              <w:rPr>
+                <w:rFonts w:ascii="Calibri" w:cs="Calibri" w:eastAsia="Calibri" w:hAnsi="Calibri"/>
+                <w:b w:val="false"/>
+                <w:bCs w:val="false"/>
+                <w:sz w:val="20"/>
+                <w:szCs w:val="20"/>
+              </w:rPr>
+              <w:t xml:space="preserve">0,54 µL + 134,5 µL</w:t>
+            </w:r>
+          </w:p>
+        </w:tc>
+        <w:tc>
+          <w:tcPr>
+            <w:tcW w:type="dxa" w:w="2038"/>
+            <w:tcBorders>
+              <w:top w:val="single" w:color="999999" w:sz="4"/>
+              <w:left w:val="single" w:color="999999" w:sz="4"/>
+              <w:bottom w:val="single" w:color="999999" w:sz="4"/>
+              <w:right w:val="single" w:color="999999" w:sz="4"/>
+            </w:tcBorders>
+            <w:tcMar>
+              <w:top w:type="dxa" w:w="60"/>
+              <w:left w:type="dxa" w:w="90"/>
+              <w:bottom w:type="dxa" w:w="60"/>
+              <w:right w:type="dxa" w:w="90"/>
+            </w:tcMar>
+          </w:tcPr>
+          <w:p>
+            <w:pPr>
+              <w:jc w:val="center"/>
+            </w:pPr>
+            <w:r>
+              <w:rPr>
+                <w:rFonts w:ascii="Calibri" w:cs="Calibri" w:eastAsia="Calibri" w:hAnsi="Calibri"/>
+                <w:b w:val="false"/>
+                <w:bCs w:val="false"/>
+                <w:sz w:val="20"/>
+                <w:szCs w:val="20"/>
+              </w:rPr>
+              <w:t xml:space="preserve">+12%</w:t>
             </w:r>
           </w:p>
         </w:tc>
@@ -5036,71 +5147,71 @@
       <w:tr>
         <w:tc>
           <w:tcPr>
-            <w:tcW w:type="dxa" w:w="1400"/>
-            <w:tcBorders>
-              <w:top w:val="single" w:color="999999" w:sz="4"/>
-              <w:left w:val="single" w:color="999999" w:sz="4"/>
-              <w:bottom w:val="single" w:color="999999" w:sz="4"/>
-              <w:right w:val="single" w:color="999999" w:sz="4"/>
-            </w:tcBorders>
-            <w:tcMar>
-              <w:top w:type="dxa" w:w="60"/>
-              <w:left w:type="dxa" w:w="90"/>
-              <w:bottom w:type="dxa" w:w="60"/>
-              <w:right w:type="dxa" w:w="90"/>
-            </w:tcMar>
-          </w:tcPr>
-          <w:p>
-            <w:pPr>
-              <w:jc w:val="center"/>
-            </w:pPr>
-            <w:r>
-              <w:rPr>
-                <w:rFonts w:ascii="Calibri" w:cs="Calibri" w:eastAsia="Calibri" w:hAnsi="Calibri"/>
-                <w:b w:val="false"/>
-                <w:bCs w:val="false"/>
-                <w:sz w:val="20"/>
-                <w:szCs w:val="20"/>
-              </w:rPr>
-              <w:t xml:space="preserve">K14 (rabbit)</w:t>
-            </w:r>
-          </w:p>
-        </w:tc>
-        <w:tc>
-          <w:tcPr>
-            <w:tcW w:type="dxa" w:w="1000"/>
-            <w:tcBorders>
-              <w:top w:val="single" w:color="999999" w:sz="4"/>
-              <w:left w:val="single" w:color="999999" w:sz="4"/>
-              <w:bottom w:val="single" w:color="999999" w:sz="4"/>
-              <w:right w:val="single" w:color="999999" w:sz="4"/>
-            </w:tcBorders>
-            <w:tcMar>
-              <w:top w:type="dxa" w:w="60"/>
-              <w:left w:type="dxa" w:w="90"/>
-              <w:bottom w:type="dxa" w:w="60"/>
-              <w:right w:type="dxa" w:w="90"/>
-            </w:tcMar>
-          </w:tcPr>
-          <w:p>
-            <w:pPr>
-              <w:jc w:val="center"/>
-            </w:pPr>
-            <w:r>
-              <w:rPr>
-                <w:rFonts w:ascii="Calibri" w:cs="Calibri" w:eastAsia="Calibri" w:hAnsi="Calibri"/>
-                <w:b w:val="false"/>
-                <w:bCs w:val="false"/>
-                <w:sz w:val="20"/>
-                <w:szCs w:val="20"/>
-              </w:rPr>
-              <w:t xml:space="preserve">1:250</w:t>
-            </w:r>
-          </w:p>
-        </w:tc>
-        <w:tc>
-          <w:tcPr>
-            <w:tcW w:type="dxa" w:w="1400"/>
+            <w:tcW w:type="dxa" w:w="1300"/>
+            <w:tcBorders>
+              <w:top w:val="single" w:color="999999" w:sz="4"/>
+              <w:left w:val="single" w:color="999999" w:sz="4"/>
+              <w:bottom w:val="single" w:color="999999" w:sz="4"/>
+              <w:right w:val="single" w:color="999999" w:sz="4"/>
+            </w:tcBorders>
+            <w:tcMar>
+              <w:top w:type="dxa" w:w="60"/>
+              <w:left w:type="dxa" w:w="90"/>
+              <w:bottom w:type="dxa" w:w="60"/>
+              <w:right w:type="dxa" w:w="90"/>
+            </w:tcMar>
+          </w:tcPr>
+          <w:p>
+            <w:pPr>
+              <w:jc w:val="center"/>
+            </w:pPr>
+            <w:r>
+              <w:rPr>
+                <w:rFonts w:ascii="Calibri" w:cs="Calibri" w:eastAsia="Calibri" w:hAnsi="Calibri"/>
+                <w:b w:val="false"/>
+                <w:bCs w:val="false"/>
+                <w:sz w:val="20"/>
+                <w:szCs w:val="20"/>
+              </w:rPr>
+              <w:t xml:space="preserve">K5 (rabbit)</w:t>
+            </w:r>
+          </w:p>
+        </w:tc>
+        <w:tc>
+          <w:tcPr>
+            <w:tcW w:type="dxa" w:w="900"/>
+            <w:tcBorders>
+              <w:top w:val="single" w:color="999999" w:sz="4"/>
+              <w:left w:val="single" w:color="999999" w:sz="4"/>
+              <w:bottom w:val="single" w:color="999999" w:sz="4"/>
+              <w:right w:val="single" w:color="999999" w:sz="4"/>
+            </w:tcBorders>
+            <w:tcMar>
+              <w:top w:type="dxa" w:w="60"/>
+              <w:left w:type="dxa" w:w="90"/>
+              <w:bottom w:type="dxa" w:w="60"/>
+              <w:right w:type="dxa" w:w="90"/>
+            </w:tcMar>
+          </w:tcPr>
+          <w:p>
+            <w:pPr>
+              <w:jc w:val="center"/>
+            </w:pPr>
+            <w:r>
+              <w:rPr>
+                <w:rFonts w:ascii="Calibri" w:cs="Calibri" w:eastAsia="Calibri" w:hAnsi="Calibri"/>
+                <w:b w:val="false"/>
+                <w:bCs w:val="false"/>
+                <w:sz w:val="20"/>
+                <w:szCs w:val="20"/>
+              </w:rPr>
+              <w:t xml:space="preserve">1:300</w:t>
+            </w:r>
+          </w:p>
+        </w:tc>
+        <w:tc>
+          <w:tcPr>
+            <w:tcW w:type="dxa" w:w="1200"/>
             <w:tcBorders>
               <w:top w:val="single" w:color="999999" w:sz="4"/>
               <w:left w:val="single" w:color="999999" w:sz="4"/>
@@ -5132,7 +5243,39 @@
         </w:tc>
         <w:tc>
           <w:tcPr>
-            <w:tcW w:type="dxa" w:w="1400"/>
+            <w:tcW w:type="dxa" w:w="1300"/>
+            <w:tcBorders>
+              <w:top w:val="single" w:color="999999" w:sz="4"/>
+              <w:left w:val="single" w:color="999999" w:sz="4"/>
+              <w:bottom w:val="single" w:color="999999" w:sz="4"/>
+              <w:right w:val="single" w:color="999999" w:sz="4"/>
+            </w:tcBorders>
+            <w:tcMar>
+              <w:top w:type="dxa" w:w="60"/>
+              <w:left w:type="dxa" w:w="90"/>
+              <w:bottom w:type="dxa" w:w="60"/>
+              <w:right w:type="dxa" w:w="90"/>
+            </w:tcMar>
+          </w:tcPr>
+          <w:p>
+            <w:pPr>
+              <w:jc w:val="center"/>
+            </w:pPr>
+            <w:r>
+              <w:rPr>
+                <w:rFonts w:ascii="Calibri" w:cs="Calibri" w:eastAsia="Calibri" w:hAnsi="Calibri"/>
+                <w:b w:val="false"/>
+                <w:bCs w:val="false"/>
+                <w:sz w:val="20"/>
+                <w:szCs w:val="20"/>
+              </w:rPr>
+              <w:t xml:space="preserve">120 µL</w:t>
+            </w:r>
+          </w:p>
+        </w:tc>
+        <w:tc>
+          <w:tcPr>
+            <w:tcW w:type="dxa" w:w="1300"/>
             <w:tcBorders>
               <w:top w:val="single" w:color="999999" w:sz="4"/>
               <w:left w:val="single" w:color="999999" w:sz="4"/>
@@ -5164,65 +5307,65 @@
         </w:tc>
         <w:tc>
           <w:tcPr>
-            <w:tcW w:type="dxa" w:w="1900"/>
-            <w:tcBorders>
-              <w:top w:val="single" w:color="999999" w:sz="4"/>
-              <w:left w:val="single" w:color="999999" w:sz="4"/>
-              <w:bottom w:val="single" w:color="999999" w:sz="4"/>
-              <w:right w:val="single" w:color="999999" w:sz="4"/>
-            </w:tcBorders>
-            <w:tcMar>
-              <w:top w:type="dxa" w:w="60"/>
-              <w:left w:type="dxa" w:w="90"/>
-              <w:bottom w:type="dxa" w:w="60"/>
-              <w:right w:type="dxa" w:w="90"/>
-            </w:tcMar>
-          </w:tcPr>
-          <w:p>
-            <w:pPr>
-              <w:jc w:val="center"/>
-            </w:pPr>
-            <w:r>
-              <w:rPr>
-                <w:rFonts w:ascii="Calibri" w:cs="Calibri" w:eastAsia="Calibri" w:hAnsi="Calibri"/>
-                <w:b w:val="false"/>
-                <w:bCs w:val="false"/>
-                <w:sz w:val="20"/>
-                <w:szCs w:val="20"/>
-              </w:rPr>
-              <w:t xml:space="preserve">0,6 µL</w:t>
-            </w:r>
-          </w:p>
-        </w:tc>
-        <w:tc>
-          <w:tcPr>
-            <w:tcW w:type="dxa" w:w="2538"/>
-            <w:tcBorders>
-              <w:top w:val="single" w:color="999999" w:sz="4"/>
-              <w:left w:val="single" w:color="999999" w:sz="4"/>
-              <w:bottom w:val="single" w:color="999999" w:sz="4"/>
-              <w:right w:val="single" w:color="999999" w:sz="4"/>
-            </w:tcBorders>
-            <w:tcMar>
-              <w:top w:type="dxa" w:w="60"/>
-              <w:left w:type="dxa" w:w="90"/>
-              <w:bottom w:type="dxa" w:w="60"/>
-              <w:right w:type="dxa" w:w="90"/>
-            </w:tcMar>
-          </w:tcPr>
-          <w:p>
-            <w:pPr>
-              <w:jc w:val="center"/>
-            </w:pPr>
-            <w:r>
-              <w:rPr>
-                <w:rFonts w:ascii="Calibri" w:cs="Calibri" w:eastAsia="Calibri" w:hAnsi="Calibri"/>
-                <w:b w:val="false"/>
-                <w:bCs w:val="false"/>
-                <w:sz w:val="20"/>
-                <w:szCs w:val="20"/>
-              </w:rPr>
-              <w:t xml:space="preserve">149,4 µL</w:t>
+            <w:tcW w:type="dxa" w:w="1600"/>
+            <w:tcBorders>
+              <w:top w:val="single" w:color="999999" w:sz="4"/>
+              <w:left w:val="single" w:color="999999" w:sz="4"/>
+              <w:bottom w:val="single" w:color="999999" w:sz="4"/>
+              <w:right w:val="single" w:color="999999" w:sz="4"/>
+            </w:tcBorders>
+            <w:tcMar>
+              <w:top w:type="dxa" w:w="60"/>
+              <w:left w:type="dxa" w:w="90"/>
+              <w:bottom w:type="dxa" w:w="60"/>
+              <w:right w:type="dxa" w:w="90"/>
+            </w:tcMar>
+          </w:tcPr>
+          <w:p>
+            <w:pPr>
+              <w:jc w:val="center"/>
+            </w:pPr>
+            <w:r>
+              <w:rPr>
+                <w:rFonts w:ascii="Calibri" w:cs="Calibri" w:eastAsia="Calibri" w:hAnsi="Calibri"/>
+                <w:b w:val="false"/>
+                <w:bCs w:val="false"/>
+                <w:sz w:val="20"/>
+                <w:szCs w:val="20"/>
+              </w:rPr>
+              <w:t xml:space="preserve">0,5 µL + 149,5 µL</w:t>
+            </w:r>
+          </w:p>
+        </w:tc>
+        <w:tc>
+          <w:tcPr>
+            <w:tcW w:type="dxa" w:w="2038"/>
+            <w:tcBorders>
+              <w:top w:val="single" w:color="999999" w:sz="4"/>
+              <w:left w:val="single" w:color="999999" w:sz="4"/>
+              <w:bottom w:val="single" w:color="999999" w:sz="4"/>
+              <w:right w:val="single" w:color="999999" w:sz="4"/>
+            </w:tcBorders>
+            <w:tcMar>
+              <w:top w:type="dxa" w:w="60"/>
+              <w:left w:type="dxa" w:w="90"/>
+              <w:bottom w:type="dxa" w:w="60"/>
+              <w:right w:type="dxa" w:w="90"/>
+            </w:tcMar>
+          </w:tcPr>
+          <w:p>
+            <w:pPr>
+              <w:jc w:val="center"/>
+            </w:pPr>
+            <w:r>
+              <w:rPr>
+                <w:rFonts w:ascii="Calibri" w:cs="Calibri" w:eastAsia="Calibri" w:hAnsi="Calibri"/>
+                <w:b w:val="false"/>
+                <w:bCs w:val="false"/>
+                <w:sz w:val="20"/>
+                <w:szCs w:val="20"/>
+              </w:rPr>
+              <w:t xml:space="preserve">+25% (mín. pipeteo 0,5 µL)</w:t>
             </w:r>
           </w:p>
         </w:tc>
@@ -5230,193 +5373,225 @@
       <w:tr>
         <w:tc>
           <w:tcPr>
-            <w:tcW w:type="dxa" w:w="1400"/>
-            <w:tcBorders>
-              <w:top w:val="single" w:color="999999" w:sz="4"/>
-              <w:left w:val="single" w:color="999999" w:sz="4"/>
-              <w:bottom w:val="single" w:color="999999" w:sz="4"/>
-              <w:right w:val="single" w:color="999999" w:sz="4"/>
-            </w:tcBorders>
-            <w:tcMar>
-              <w:top w:type="dxa" w:w="60"/>
-              <w:left w:type="dxa" w:w="90"/>
-              <w:bottom w:type="dxa" w:w="60"/>
-              <w:right w:type="dxa" w:w="90"/>
-            </w:tcMar>
-          </w:tcPr>
-          <w:p>
-            <w:pPr>
-              <w:jc w:val="center"/>
-            </w:pPr>
-            <w:r>
-              <w:rPr>
-                <w:rFonts w:ascii="Calibri" w:cs="Calibri" w:eastAsia="Calibri" w:hAnsi="Calibri"/>
-                <w:b w:val="false"/>
-                <w:bCs w:val="false"/>
-                <w:sz w:val="20"/>
-                <w:szCs w:val="20"/>
-              </w:rPr>
-              <w:t xml:space="preserve">K10 (mouse, DE-K10)</w:t>
-            </w:r>
-          </w:p>
-        </w:tc>
-        <w:tc>
-          <w:tcPr>
-            <w:tcW w:type="dxa" w:w="1000"/>
-            <w:tcBorders>
-              <w:top w:val="single" w:color="999999" w:sz="4"/>
-              <w:left w:val="single" w:color="999999" w:sz="4"/>
-              <w:bottom w:val="single" w:color="999999" w:sz="4"/>
-              <w:right w:val="single" w:color="999999" w:sz="4"/>
-            </w:tcBorders>
-            <w:tcMar>
-              <w:top w:type="dxa" w:w="60"/>
-              <w:left w:type="dxa" w:w="90"/>
-              <w:bottom w:type="dxa" w:w="60"/>
-              <w:right w:type="dxa" w:w="90"/>
-            </w:tcMar>
-          </w:tcPr>
-          <w:p>
-            <w:pPr>
-              <w:jc w:val="center"/>
-            </w:pPr>
-            <w:r>
-              <w:rPr>
-                <w:rFonts w:ascii="Calibri" w:cs="Calibri" w:eastAsia="Calibri" w:hAnsi="Calibri"/>
-                <w:b w:val="false"/>
-                <w:bCs w:val="false"/>
-                <w:sz w:val="20"/>
-                <w:szCs w:val="20"/>
-              </w:rPr>
-              <w:t xml:space="preserve">1:200</w:t>
-            </w:r>
-          </w:p>
-        </w:tc>
-        <w:tc>
-          <w:tcPr>
-            <w:tcW w:type="dxa" w:w="1400"/>
-            <w:tcBorders>
-              <w:top w:val="single" w:color="999999" w:sz="4"/>
-              <w:left w:val="single" w:color="999999" w:sz="4"/>
-              <w:bottom w:val="single" w:color="999999" w:sz="4"/>
-              <w:right w:val="single" w:color="999999" w:sz="4"/>
-            </w:tcBorders>
-            <w:tcMar>
-              <w:top w:type="dxa" w:w="60"/>
-              <w:left w:type="dxa" w:w="90"/>
-              <w:bottom w:type="dxa" w:w="60"/>
-              <w:right w:type="dxa" w:w="90"/>
-            </w:tcMar>
-          </w:tcPr>
-          <w:p>
-            <w:pPr>
-              <w:jc w:val="center"/>
-            </w:pPr>
-            <w:r>
-              <w:rPr>
-                <w:rFonts w:ascii="Calibri" w:cs="Calibri" w:eastAsia="Calibri" w:hAnsi="Calibri"/>
-                <w:b w:val="false"/>
-                <w:bCs w:val="false"/>
-                <w:sz w:val="20"/>
-                <w:szCs w:val="20"/>
-              </w:rPr>
-              <w:t xml:space="preserve">6</w:t>
-            </w:r>
-          </w:p>
-        </w:tc>
-        <w:tc>
-          <w:tcPr>
-            <w:tcW w:type="dxa" w:w="1400"/>
-            <w:tcBorders>
-              <w:top w:val="single" w:color="999999" w:sz="4"/>
-              <w:left w:val="single" w:color="999999" w:sz="4"/>
-              <w:bottom w:val="single" w:color="999999" w:sz="4"/>
-              <w:right w:val="single" w:color="999999" w:sz="4"/>
-            </w:tcBorders>
-            <w:tcMar>
-              <w:top w:type="dxa" w:w="60"/>
-              <w:left w:type="dxa" w:w="90"/>
-              <w:bottom w:type="dxa" w:w="60"/>
-              <w:right w:type="dxa" w:w="90"/>
-            </w:tcMar>
-          </w:tcPr>
-          <w:p>
-            <w:pPr>
-              <w:jc w:val="center"/>
-            </w:pPr>
-            <w:r>
-              <w:rPr>
-                <w:rFonts w:ascii="Calibri" w:cs="Calibri" w:eastAsia="Calibri" w:hAnsi="Calibri"/>
-                <w:b w:val="false"/>
-                <w:bCs w:val="false"/>
-                <w:sz w:val="20"/>
-                <w:szCs w:val="20"/>
-              </w:rPr>
-              <w:t xml:space="preserve">200 µL</w:t>
-            </w:r>
-          </w:p>
-        </w:tc>
-        <w:tc>
-          <w:tcPr>
-            <w:tcW w:type="dxa" w:w="1900"/>
-            <w:tcBorders>
-              <w:top w:val="single" w:color="999999" w:sz="4"/>
-              <w:left w:val="single" w:color="999999" w:sz="4"/>
-              <w:bottom w:val="single" w:color="999999" w:sz="4"/>
-              <w:right w:val="single" w:color="999999" w:sz="4"/>
-            </w:tcBorders>
-            <w:tcMar>
-              <w:top w:type="dxa" w:w="60"/>
-              <w:left w:type="dxa" w:w="90"/>
-              <w:bottom w:type="dxa" w:w="60"/>
-              <w:right w:type="dxa" w:w="90"/>
-            </w:tcMar>
-          </w:tcPr>
-          <w:p>
-            <w:pPr>
-              <w:jc w:val="center"/>
-            </w:pPr>
-            <w:r>
-              <w:rPr>
-                <w:rFonts w:ascii="Calibri" w:cs="Calibri" w:eastAsia="Calibri" w:hAnsi="Calibri"/>
-                <w:b w:val="false"/>
-                <w:bCs w:val="false"/>
-                <w:sz w:val="20"/>
-                <w:szCs w:val="20"/>
-              </w:rPr>
-              <w:t xml:space="preserve">1 µL</w:t>
-            </w:r>
-          </w:p>
-        </w:tc>
-        <w:tc>
-          <w:tcPr>
-            <w:tcW w:type="dxa" w:w="2538"/>
-            <w:tcBorders>
-              <w:top w:val="single" w:color="999999" w:sz="4"/>
-              <w:left w:val="single" w:color="999999" w:sz="4"/>
-              <w:bottom w:val="single" w:color="999999" w:sz="4"/>
-              <w:right w:val="single" w:color="999999" w:sz="4"/>
-            </w:tcBorders>
-            <w:tcMar>
-              <w:top w:type="dxa" w:w="60"/>
-              <w:left w:type="dxa" w:w="90"/>
-              <w:bottom w:type="dxa" w:w="60"/>
-              <w:right w:type="dxa" w:w="90"/>
-            </w:tcMar>
-          </w:tcPr>
-          <w:p>
-            <w:pPr>
-              <w:jc w:val="center"/>
-            </w:pPr>
-            <w:r>
-              <w:rPr>
-                <w:rFonts w:ascii="Calibri" w:cs="Calibri" w:eastAsia="Calibri" w:hAnsi="Calibri"/>
-                <w:b w:val="false"/>
-                <w:bCs w:val="false"/>
-                <w:sz w:val="20"/>
-                <w:szCs w:val="20"/>
-              </w:rPr>
-              <w:t xml:space="preserve">199 µL</w:t>
+            <w:tcW w:type="dxa" w:w="1300"/>
+            <w:tcBorders>
+              <w:top w:val="single" w:color="999999" w:sz="4"/>
+              <w:left w:val="single" w:color="999999" w:sz="4"/>
+              <w:bottom w:val="single" w:color="999999" w:sz="4"/>
+              <w:right w:val="single" w:color="999999" w:sz="4"/>
+            </w:tcBorders>
+            <w:tcMar>
+              <w:top w:type="dxa" w:w="60"/>
+              <w:left w:type="dxa" w:w="90"/>
+              <w:bottom w:type="dxa" w:w="60"/>
+              <w:right w:type="dxa" w:w="90"/>
+            </w:tcMar>
+          </w:tcPr>
+          <w:p>
+            <w:pPr>
+              <w:jc w:val="center"/>
+            </w:pPr>
+            <w:r>
+              <w:rPr>
+                <w:rFonts w:ascii="Calibri" w:cs="Calibri" w:eastAsia="Calibri" w:hAnsi="Calibri"/>
+                <w:b w:val="false"/>
+                <w:bCs w:val="false"/>
+                <w:sz w:val="20"/>
+                <w:szCs w:val="20"/>
+              </w:rPr>
+              <w:t xml:space="preserve">K14 (rabbit)</w:t>
+            </w:r>
+          </w:p>
+        </w:tc>
+        <w:tc>
+          <w:tcPr>
+            <w:tcW w:type="dxa" w:w="900"/>
+            <w:tcBorders>
+              <w:top w:val="single" w:color="999999" w:sz="4"/>
+              <w:left w:val="single" w:color="999999" w:sz="4"/>
+              <w:bottom w:val="single" w:color="999999" w:sz="4"/>
+              <w:right w:val="single" w:color="999999" w:sz="4"/>
+            </w:tcBorders>
+            <w:tcMar>
+              <w:top w:type="dxa" w:w="60"/>
+              <w:left w:type="dxa" w:w="90"/>
+              <w:bottom w:type="dxa" w:w="60"/>
+              <w:right w:type="dxa" w:w="90"/>
+            </w:tcMar>
+          </w:tcPr>
+          <w:p>
+            <w:pPr>
+              <w:jc w:val="center"/>
+            </w:pPr>
+            <w:r>
+              <w:rPr>
+                <w:rFonts w:ascii="Calibri" w:cs="Calibri" w:eastAsia="Calibri" w:hAnsi="Calibri"/>
+                <w:b w:val="false"/>
+                <w:bCs w:val="false"/>
+                <w:sz w:val="20"/>
+                <w:szCs w:val="20"/>
+              </w:rPr>
+              <w:t xml:space="preserve">1:250</w:t>
+            </w:r>
+          </w:p>
+        </w:tc>
+        <w:tc>
+          <w:tcPr>
+            <w:tcW w:type="dxa" w:w="1200"/>
+            <w:tcBorders>
+              <w:top w:val="single" w:color="999999" w:sz="4"/>
+              <w:left w:val="single" w:color="999999" w:sz="4"/>
+              <w:bottom w:val="single" w:color="999999" w:sz="4"/>
+              <w:right w:val="single" w:color="999999" w:sz="4"/>
+            </w:tcBorders>
+            <w:tcMar>
+              <w:top w:type="dxa" w:w="60"/>
+              <w:left w:type="dxa" w:w="90"/>
+              <w:bottom w:type="dxa" w:w="60"/>
+              <w:right w:type="dxa" w:w="90"/>
+            </w:tcMar>
+          </w:tcPr>
+          <w:p>
+            <w:pPr>
+              <w:jc w:val="center"/>
+            </w:pPr>
+            <w:r>
+              <w:rPr>
+                <w:rFonts w:ascii="Calibri" w:cs="Calibri" w:eastAsia="Calibri" w:hAnsi="Calibri"/>
+                <w:b w:val="false"/>
+                <w:bCs w:val="false"/>
+                <w:sz w:val="20"/>
+                <w:szCs w:val="20"/>
+              </w:rPr>
+              <w:t xml:space="preserve">4</w:t>
+            </w:r>
+          </w:p>
+        </w:tc>
+        <w:tc>
+          <w:tcPr>
+            <w:tcW w:type="dxa" w:w="1300"/>
+            <w:tcBorders>
+              <w:top w:val="single" w:color="999999" w:sz="4"/>
+              <w:left w:val="single" w:color="999999" w:sz="4"/>
+              <w:bottom w:val="single" w:color="999999" w:sz="4"/>
+              <w:right w:val="single" w:color="999999" w:sz="4"/>
+            </w:tcBorders>
+            <w:tcMar>
+              <w:top w:type="dxa" w:w="60"/>
+              <w:left w:type="dxa" w:w="90"/>
+              <w:bottom w:type="dxa" w:w="60"/>
+              <w:right w:type="dxa" w:w="90"/>
+            </w:tcMar>
+          </w:tcPr>
+          <w:p>
+            <w:pPr>
+              <w:jc w:val="center"/>
+            </w:pPr>
+            <w:r>
+              <w:rPr>
+                <w:rFonts w:ascii="Calibri" w:cs="Calibri" w:eastAsia="Calibri" w:hAnsi="Calibri"/>
+                <w:b w:val="false"/>
+                <w:bCs w:val="false"/>
+                <w:sz w:val="20"/>
+                <w:szCs w:val="20"/>
+              </w:rPr>
+              <w:t xml:space="preserve">120 µL</w:t>
+            </w:r>
+          </w:p>
+        </w:tc>
+        <w:tc>
+          <w:tcPr>
+            <w:tcW w:type="dxa" w:w="1300"/>
+            <w:tcBorders>
+              <w:top w:val="single" w:color="999999" w:sz="4"/>
+              <w:left w:val="single" w:color="999999" w:sz="4"/>
+              <w:bottom w:val="single" w:color="999999" w:sz="4"/>
+              <w:right w:val="single" w:color="999999" w:sz="4"/>
+            </w:tcBorders>
+            <w:tcMar>
+              <w:top w:type="dxa" w:w="60"/>
+              <w:left w:type="dxa" w:w="90"/>
+              <w:bottom w:type="dxa" w:w="60"/>
+              <w:right w:type="dxa" w:w="90"/>
+            </w:tcMar>
+          </w:tcPr>
+          <w:p>
+            <w:pPr>
+              <w:jc w:val="center"/>
+            </w:pPr>
+            <w:r>
+              <w:rPr>
+                <w:rFonts w:ascii="Calibri" w:cs="Calibri" w:eastAsia="Calibri" w:hAnsi="Calibri"/>
+                <w:b w:val="false"/>
+                <w:bCs w:val="false"/>
+                <w:sz w:val="20"/>
+                <w:szCs w:val="20"/>
+              </w:rPr>
+              <w:t xml:space="preserve">135 µL</w:t>
+            </w:r>
+          </w:p>
+        </w:tc>
+        <w:tc>
+          <w:tcPr>
+            <w:tcW w:type="dxa" w:w="1600"/>
+            <w:tcBorders>
+              <w:top w:val="single" w:color="999999" w:sz="4"/>
+              <w:left w:val="single" w:color="999999" w:sz="4"/>
+              <w:bottom w:val="single" w:color="999999" w:sz="4"/>
+              <w:right w:val="single" w:color="999999" w:sz="4"/>
+            </w:tcBorders>
+            <w:tcMar>
+              <w:top w:type="dxa" w:w="60"/>
+              <w:left w:type="dxa" w:w="90"/>
+              <w:bottom w:type="dxa" w:w="60"/>
+              <w:right w:type="dxa" w:w="90"/>
+            </w:tcMar>
+          </w:tcPr>
+          <w:p>
+            <w:pPr>
+              <w:jc w:val="center"/>
+            </w:pPr>
+            <w:r>
+              <w:rPr>
+                <w:rFonts w:ascii="Calibri" w:cs="Calibri" w:eastAsia="Calibri" w:hAnsi="Calibri"/>
+                <w:b w:val="false"/>
+                <w:bCs w:val="false"/>
+                <w:sz w:val="20"/>
+                <w:szCs w:val="20"/>
+              </w:rPr>
+              <w:t xml:space="preserve">0,54 µL + 134,5 µL</w:t>
+            </w:r>
+          </w:p>
+        </w:tc>
+        <w:tc>
+          <w:tcPr>
+            <w:tcW w:type="dxa" w:w="2038"/>
+            <w:tcBorders>
+              <w:top w:val="single" w:color="999999" w:sz="4"/>
+              <w:left w:val="single" w:color="999999" w:sz="4"/>
+              <w:bottom w:val="single" w:color="999999" w:sz="4"/>
+              <w:right w:val="single" w:color="999999" w:sz="4"/>
+            </w:tcBorders>
+            <w:tcMar>
+              <w:top w:type="dxa" w:w="60"/>
+              <w:left w:type="dxa" w:w="90"/>
+              <w:bottom w:type="dxa" w:w="60"/>
+              <w:right w:type="dxa" w:w="90"/>
+            </w:tcMar>
+          </w:tcPr>
+          <w:p>
+            <w:pPr>
+              <w:jc w:val="center"/>
+            </w:pPr>
+            <w:r>
+              <w:rPr>
+                <w:rFonts w:ascii="Calibri" w:cs="Calibri" w:eastAsia="Calibri" w:hAnsi="Calibri"/>
+                <w:b w:val="false"/>
+                <w:bCs w:val="false"/>
+                <w:sz w:val="20"/>
+                <w:szCs w:val="20"/>
+              </w:rPr>
+              <w:t xml:space="preserve">+12%</w:t>
             </w:r>
           </w:p>
         </w:tc>
@@ -5424,199 +5599,225 @@
       <w:tr>
         <w:tc>
           <w:tcPr>
-            <w:tcW w:type="dxa" w:w="1400"/>
-            <w:tcBorders>
-              <w:top w:val="single" w:color="999999" w:sz="4"/>
-              <w:left w:val="single" w:color="999999" w:sz="4"/>
-              <w:bottom w:val="single" w:color="999999" w:sz="4"/>
-              <w:right w:val="single" w:color="999999" w:sz="4"/>
-            </w:tcBorders>
-            <w:shd w:fill="FFF2CC" w:color="auto" w:val="clear"/>
-            <w:tcMar>
-              <w:top w:type="dxa" w:w="60"/>
-              <w:left w:type="dxa" w:w="90"/>
-              <w:bottom w:type="dxa" w:w="60"/>
-              <w:right w:type="dxa" w:w="90"/>
-            </w:tcMar>
-          </w:tcPr>
-          <w:p>
-            <w:pPr>
-              <w:jc w:val="center"/>
-            </w:pPr>
-            <w:r>
-              <w:rPr>
-                <w:rFonts w:ascii="Calibri" w:cs="Calibri" w:eastAsia="Calibri" w:hAnsi="Calibri"/>
-                <w:b w:val="false"/>
-                <w:bCs w:val="false"/>
-                <w:sz w:val="20"/>
-                <w:szCs w:val="20"/>
-              </w:rPr>
-              <w:t xml:space="preserve">K2</w:t>
-            </w:r>
-          </w:p>
-        </w:tc>
-        <w:tc>
-          <w:tcPr>
-            <w:tcW w:type="dxa" w:w="1000"/>
-            <w:tcBorders>
-              <w:top w:val="single" w:color="999999" w:sz="4"/>
-              <w:left w:val="single" w:color="999999" w:sz="4"/>
-              <w:bottom w:val="single" w:color="999999" w:sz="4"/>
-              <w:right w:val="single" w:color="999999" w:sz="4"/>
-            </w:tcBorders>
-            <w:shd w:fill="FFF2CC" w:color="auto" w:val="clear"/>
-            <w:tcMar>
-              <w:top w:type="dxa" w:w="60"/>
-              <w:left w:type="dxa" w:w="90"/>
-              <w:bottom w:type="dxa" w:w="60"/>
-              <w:right w:type="dxa" w:w="90"/>
-            </w:tcMar>
-          </w:tcPr>
-          <w:p>
-            <w:pPr>
-              <w:jc w:val="center"/>
-            </w:pPr>
-            <w:r>
-              <w:rPr>
-                <w:rFonts w:ascii="Calibri" w:cs="Calibri" w:eastAsia="Calibri" w:hAnsi="Calibri"/>
-                <w:b w:val="false"/>
-                <w:bCs w:val="false"/>
-                <w:sz w:val="20"/>
-                <w:szCs w:val="20"/>
-              </w:rPr>
-              <w:t xml:space="preserve">[?]</w:t>
-            </w:r>
-          </w:p>
-        </w:tc>
-        <w:tc>
-          <w:tcPr>
-            <w:tcW w:type="dxa" w:w="1400"/>
-            <w:tcBorders>
-              <w:top w:val="single" w:color="999999" w:sz="4"/>
-              <w:left w:val="single" w:color="999999" w:sz="4"/>
-              <w:bottom w:val="single" w:color="999999" w:sz="4"/>
-              <w:right w:val="single" w:color="999999" w:sz="4"/>
-            </w:tcBorders>
-            <w:shd w:fill="FFF2CC" w:color="auto" w:val="clear"/>
-            <w:tcMar>
-              <w:top w:type="dxa" w:w="60"/>
-              <w:left w:type="dxa" w:w="90"/>
-              <w:bottom w:type="dxa" w:w="60"/>
-              <w:right w:type="dxa" w:w="90"/>
-            </w:tcMar>
-          </w:tcPr>
-          <w:p>
-            <w:pPr>
-              <w:jc w:val="center"/>
-            </w:pPr>
-            <w:r>
-              <w:rPr>
-                <w:rFonts w:ascii="Calibri" w:cs="Calibri" w:eastAsia="Calibri" w:hAnsi="Calibri"/>
-                <w:b w:val="false"/>
-                <w:bCs w:val="false"/>
-                <w:sz w:val="20"/>
-                <w:szCs w:val="20"/>
-              </w:rPr>
-              <w:t xml:space="preserve">4</w:t>
-            </w:r>
-          </w:p>
-        </w:tc>
-        <w:tc>
-          <w:tcPr>
-            <w:tcW w:type="dxa" w:w="1400"/>
-            <w:tcBorders>
-              <w:top w:val="single" w:color="999999" w:sz="4"/>
-              <w:left w:val="single" w:color="999999" w:sz="4"/>
-              <w:bottom w:val="single" w:color="999999" w:sz="4"/>
-              <w:right w:val="single" w:color="999999" w:sz="4"/>
-            </w:tcBorders>
-            <w:shd w:fill="FFF2CC" w:color="auto" w:val="clear"/>
-            <w:tcMar>
-              <w:top w:type="dxa" w:w="60"/>
-              <w:left w:type="dxa" w:w="90"/>
-              <w:bottom w:type="dxa" w:w="60"/>
-              <w:right w:type="dxa" w:w="90"/>
-            </w:tcMar>
-          </w:tcPr>
-          <w:p>
-            <w:pPr>
-              <w:jc w:val="center"/>
-            </w:pPr>
-            <w:r>
-              <w:rPr>
-                <w:rFonts w:ascii="Calibri" w:cs="Calibri" w:eastAsia="Calibri" w:hAnsi="Calibri"/>
-                <w:b w:val="false"/>
-                <w:bCs w:val="false"/>
-                <w:sz w:val="20"/>
-                <w:szCs w:val="20"/>
-              </w:rPr>
-              <w:t xml:space="preserve">150 µL</w:t>
-            </w:r>
-          </w:p>
-        </w:tc>
-        <w:tc>
-          <w:tcPr>
-            <w:tcW w:type="dxa" w:w="1900"/>
-            <w:tcBorders>
-              <w:top w:val="single" w:color="999999" w:sz="4"/>
-              <w:left w:val="single" w:color="999999" w:sz="4"/>
-              <w:bottom w:val="single" w:color="999999" w:sz="4"/>
-              <w:right w:val="single" w:color="999999" w:sz="4"/>
-            </w:tcBorders>
-            <w:shd w:fill="FFF2CC" w:color="auto" w:val="clear"/>
-            <w:tcMar>
-              <w:top w:type="dxa" w:w="60"/>
-              <w:left w:type="dxa" w:w="90"/>
-              <w:bottom w:type="dxa" w:w="60"/>
-              <w:right w:type="dxa" w:w="90"/>
-            </w:tcMar>
-          </w:tcPr>
-          <w:p>
-            <w:pPr>
-              <w:jc w:val="center"/>
-            </w:pPr>
-            <w:r>
-              <w:rPr>
-                <w:rFonts w:ascii="Calibri" w:cs="Calibri" w:eastAsia="Calibri" w:hAnsi="Calibri"/>
-                <w:b w:val="false"/>
-                <w:bCs w:val="false"/>
-                <w:sz w:val="20"/>
-                <w:szCs w:val="20"/>
-              </w:rPr>
-              <w:t xml:space="preserve">ver tabla K2</w:t>
-            </w:r>
-          </w:p>
-        </w:tc>
-        <w:tc>
-          <w:tcPr>
-            <w:tcW w:type="dxa" w:w="2538"/>
-            <w:tcBorders>
-              <w:top w:val="single" w:color="999999" w:sz="4"/>
-              <w:left w:val="single" w:color="999999" w:sz="4"/>
-              <w:bottom w:val="single" w:color="999999" w:sz="4"/>
-              <w:right w:val="single" w:color="999999" w:sz="4"/>
-            </w:tcBorders>
-            <w:shd w:fill="FFF2CC" w:color="auto" w:val="clear"/>
-            <w:tcMar>
-              <w:top w:type="dxa" w:w="60"/>
-              <w:left w:type="dxa" w:w="90"/>
-              <w:bottom w:type="dxa" w:w="60"/>
-              <w:right w:type="dxa" w:w="90"/>
-            </w:tcMar>
-          </w:tcPr>
-          <w:p>
-            <w:pPr>
-              <w:jc w:val="center"/>
-            </w:pPr>
-            <w:r>
-              <w:rPr>
-                <w:rFonts w:ascii="Calibri" w:cs="Calibri" w:eastAsia="Calibri" w:hAnsi="Calibri"/>
-                <w:b w:val="false"/>
-                <w:bCs w:val="false"/>
-                <w:sz w:val="20"/>
-                <w:szCs w:val="20"/>
-              </w:rPr>
-              <w:t xml:space="preserve">ver tabla K2</w:t>
+            <w:tcW w:type="dxa" w:w="1300"/>
+            <w:tcBorders>
+              <w:top w:val="single" w:color="999999" w:sz="4"/>
+              <w:left w:val="single" w:color="999999" w:sz="4"/>
+              <w:bottom w:val="single" w:color="999999" w:sz="4"/>
+              <w:right w:val="single" w:color="999999" w:sz="4"/>
+            </w:tcBorders>
+            <w:tcMar>
+              <w:top w:type="dxa" w:w="60"/>
+              <w:left w:type="dxa" w:w="90"/>
+              <w:bottom w:type="dxa" w:w="60"/>
+              <w:right w:type="dxa" w:w="90"/>
+            </w:tcMar>
+          </w:tcPr>
+          <w:p>
+            <w:pPr>
+              <w:jc w:val="center"/>
+            </w:pPr>
+            <w:r>
+              <w:rPr>
+                <w:rFonts w:ascii="Calibri" w:cs="Calibri" w:eastAsia="Calibri" w:hAnsi="Calibri"/>
+                <w:b w:val="false"/>
+                <w:bCs w:val="false"/>
+                <w:sz w:val="20"/>
+                <w:szCs w:val="20"/>
+              </w:rPr>
+              <w:t xml:space="preserve">K10 (mouse, DE-K10)</w:t>
+            </w:r>
+          </w:p>
+        </w:tc>
+        <w:tc>
+          <w:tcPr>
+            <w:tcW w:type="dxa" w:w="900"/>
+            <w:tcBorders>
+              <w:top w:val="single" w:color="999999" w:sz="4"/>
+              <w:left w:val="single" w:color="999999" w:sz="4"/>
+              <w:bottom w:val="single" w:color="999999" w:sz="4"/>
+              <w:right w:val="single" w:color="999999" w:sz="4"/>
+            </w:tcBorders>
+            <w:tcMar>
+              <w:top w:type="dxa" w:w="60"/>
+              <w:left w:type="dxa" w:w="90"/>
+              <w:bottom w:type="dxa" w:w="60"/>
+              <w:right w:type="dxa" w:w="90"/>
+            </w:tcMar>
+          </w:tcPr>
+          <w:p>
+            <w:pPr>
+              <w:jc w:val="center"/>
+            </w:pPr>
+            <w:r>
+              <w:rPr>
+                <w:rFonts w:ascii="Calibri" w:cs="Calibri" w:eastAsia="Calibri" w:hAnsi="Calibri"/>
+                <w:b w:val="false"/>
+                <w:bCs w:val="false"/>
+                <w:sz w:val="20"/>
+                <w:szCs w:val="20"/>
+              </w:rPr>
+              <w:t xml:space="preserve">1:100</w:t>
+            </w:r>
+          </w:p>
+        </w:tc>
+        <w:tc>
+          <w:tcPr>
+            <w:tcW w:type="dxa" w:w="1200"/>
+            <w:tcBorders>
+              <w:top w:val="single" w:color="999999" w:sz="4"/>
+              <w:left w:val="single" w:color="999999" w:sz="4"/>
+              <w:bottom w:val="single" w:color="999999" w:sz="4"/>
+              <w:right w:val="single" w:color="999999" w:sz="4"/>
+            </w:tcBorders>
+            <w:tcMar>
+              <w:top w:type="dxa" w:w="60"/>
+              <w:left w:type="dxa" w:w="90"/>
+              <w:bottom w:type="dxa" w:w="60"/>
+              <w:right w:type="dxa" w:w="90"/>
+            </w:tcMar>
+          </w:tcPr>
+          <w:p>
+            <w:pPr>
+              <w:jc w:val="center"/>
+            </w:pPr>
+            <w:r>
+              <w:rPr>
+                <w:rFonts w:ascii="Calibri" w:cs="Calibri" w:eastAsia="Calibri" w:hAnsi="Calibri"/>
+                <w:b w:val="false"/>
+                <w:bCs w:val="false"/>
+                <w:sz w:val="20"/>
+                <w:szCs w:val="20"/>
+              </w:rPr>
+              <w:t xml:space="preserve">6</w:t>
+            </w:r>
+          </w:p>
+        </w:tc>
+        <w:tc>
+          <w:tcPr>
+            <w:tcW w:type="dxa" w:w="1300"/>
+            <w:tcBorders>
+              <w:top w:val="single" w:color="999999" w:sz="4"/>
+              <w:left w:val="single" w:color="999999" w:sz="4"/>
+              <w:bottom w:val="single" w:color="999999" w:sz="4"/>
+              <w:right w:val="single" w:color="999999" w:sz="4"/>
+            </w:tcBorders>
+            <w:tcMar>
+              <w:top w:type="dxa" w:w="60"/>
+              <w:left w:type="dxa" w:w="90"/>
+              <w:bottom w:type="dxa" w:w="60"/>
+              <w:right w:type="dxa" w:w="90"/>
+            </w:tcMar>
+          </w:tcPr>
+          <w:p>
+            <w:pPr>
+              <w:jc w:val="center"/>
+            </w:pPr>
+            <w:r>
+              <w:rPr>
+                <w:rFonts w:ascii="Calibri" w:cs="Calibri" w:eastAsia="Calibri" w:hAnsi="Calibri"/>
+                <w:b w:val="false"/>
+                <w:bCs w:val="false"/>
+                <w:sz w:val="20"/>
+                <w:szCs w:val="20"/>
+              </w:rPr>
+              <w:t xml:space="preserve">180 µL</w:t>
+            </w:r>
+          </w:p>
+        </w:tc>
+        <w:tc>
+          <w:tcPr>
+            <w:tcW w:type="dxa" w:w="1300"/>
+            <w:tcBorders>
+              <w:top w:val="single" w:color="999999" w:sz="4"/>
+              <w:left w:val="single" w:color="999999" w:sz="4"/>
+              <w:bottom w:val="single" w:color="999999" w:sz="4"/>
+              <w:right w:val="single" w:color="999999" w:sz="4"/>
+            </w:tcBorders>
+            <w:tcMar>
+              <w:top w:type="dxa" w:w="60"/>
+              <w:left w:type="dxa" w:w="90"/>
+              <w:bottom w:type="dxa" w:w="60"/>
+              <w:right w:type="dxa" w:w="90"/>
+            </w:tcMar>
+          </w:tcPr>
+          <w:p>
+            <w:pPr>
+              <w:jc w:val="center"/>
+            </w:pPr>
+            <w:r>
+              <w:rPr>
+                <w:rFonts w:ascii="Calibri" w:cs="Calibri" w:eastAsia="Calibri" w:hAnsi="Calibri"/>
+                <w:b w:val="false"/>
+                <w:bCs w:val="false"/>
+                <w:sz w:val="20"/>
+                <w:szCs w:val="20"/>
+              </w:rPr>
+              <w:t xml:space="preserve">200 µL</w:t>
+            </w:r>
+          </w:p>
+        </w:tc>
+        <w:tc>
+          <w:tcPr>
+            <w:tcW w:type="dxa" w:w="1600"/>
+            <w:tcBorders>
+              <w:top w:val="single" w:color="999999" w:sz="4"/>
+              <w:left w:val="single" w:color="999999" w:sz="4"/>
+              <w:bottom w:val="single" w:color="999999" w:sz="4"/>
+              <w:right w:val="single" w:color="999999" w:sz="4"/>
+            </w:tcBorders>
+            <w:tcMar>
+              <w:top w:type="dxa" w:w="60"/>
+              <w:left w:type="dxa" w:w="90"/>
+              <w:bottom w:type="dxa" w:w="60"/>
+              <w:right w:type="dxa" w:w="90"/>
+            </w:tcMar>
+          </w:tcPr>
+          <w:p>
+            <w:pPr>
+              <w:jc w:val="center"/>
+            </w:pPr>
+            <w:r>
+              <w:rPr>
+                <w:rFonts w:ascii="Calibri" w:cs="Calibri" w:eastAsia="Calibri" w:hAnsi="Calibri"/>
+                <w:b w:val="false"/>
+                <w:bCs w:val="false"/>
+                <w:sz w:val="20"/>
+                <w:szCs w:val="20"/>
+              </w:rPr>
+              <w:t xml:space="preserve">2 µL + 198 µL</w:t>
+            </w:r>
+          </w:p>
+        </w:tc>
+        <w:tc>
+          <w:tcPr>
+            <w:tcW w:type="dxa" w:w="2038"/>
+            <w:tcBorders>
+              <w:top w:val="single" w:color="999999" w:sz="4"/>
+              <w:left w:val="single" w:color="999999" w:sz="4"/>
+              <w:bottom w:val="single" w:color="999999" w:sz="4"/>
+              <w:right w:val="single" w:color="999999" w:sz="4"/>
+            </w:tcBorders>
+            <w:tcMar>
+              <w:top w:type="dxa" w:w="60"/>
+              <w:left w:type="dxa" w:w="90"/>
+              <w:bottom w:type="dxa" w:w="60"/>
+              <w:right w:type="dxa" w:w="90"/>
+            </w:tcMar>
+          </w:tcPr>
+          <w:p>
+            <w:pPr>
+              <w:jc w:val="center"/>
+            </w:pPr>
+            <w:r>
+              <w:rPr>
+                <w:rFonts w:ascii="Calibri" w:cs="Calibri" w:eastAsia="Calibri" w:hAnsi="Calibri"/>
+                <w:b w:val="false"/>
+                <w:bCs w:val="false"/>
+                <w:sz w:val="20"/>
+                <w:szCs w:val="20"/>
+              </w:rPr>
+              <w:t xml:space="preserve">+11%</w:t>
             </w:r>
           </w:p>
         </w:tc>
@@ -5624,7 +5825,7 @@
       <w:tr>
         <w:tc>
           <w:tcPr>
-            <w:tcW w:type="dxa" w:w="1400"/>
+            <w:tcW w:type="dxa" w:w="1300"/>
             <w:tcBorders>
               <w:top w:val="single" w:color="999999" w:sz="4"/>
               <w:left w:val="single" w:color="999999" w:sz="4"/>
@@ -5656,7 +5857,7 @@
         </w:tc>
         <w:tc>
           <w:tcPr>
-            <w:tcW w:type="dxa" w:w="1000"/>
+            <w:tcW w:type="dxa" w:w="900"/>
             <w:tcBorders>
               <w:top w:val="single" w:color="999999" w:sz="4"/>
               <w:left w:val="single" w:color="999999" w:sz="4"/>
@@ -5688,7 +5889,7 @@
         </w:tc>
         <w:tc>
           <w:tcPr>
-            <w:tcW w:type="dxa" w:w="1400"/>
+            <w:tcW w:type="dxa" w:w="1200"/>
             <w:tcBorders>
               <w:top w:val="single" w:color="999999" w:sz="4"/>
               <w:left w:val="single" w:color="999999" w:sz="4"/>
@@ -5720,7 +5921,7 @@
         </w:tc>
         <w:tc>
           <w:tcPr>
-            <w:tcW w:type="dxa" w:w="1400"/>
+            <w:tcW w:type="dxa" w:w="1300"/>
             <w:tcBorders>
               <w:top w:val="single" w:color="999999" w:sz="4"/>
               <w:left w:val="single" w:color="999999" w:sz="4"/>
@@ -5752,7 +5953,7 @@
         </w:tc>
         <w:tc>
           <w:tcPr>
-            <w:tcW w:type="dxa" w:w="1900"/>
+            <w:tcW w:type="dxa" w:w="1300"/>
             <w:tcBorders>
               <w:top w:val="single" w:color="999999" w:sz="4"/>
               <w:left w:val="single" w:color="999999" w:sz="4"/>
@@ -5784,7 +5985,7 @@
         </w:tc>
         <w:tc>
           <w:tcPr>
-            <w:tcW w:type="dxa" w:w="2538"/>
+            <w:tcW w:type="dxa" w:w="1600"/>
             <w:tcBorders>
               <w:top w:val="single" w:color="999999" w:sz="4"/>
               <w:left w:val="single" w:color="999999" w:sz="4"/>
@@ -5814,696 +6015,35 @@
             </w:r>
           </w:p>
         </w:tc>
-      </w:tr>
-    </w:tbl>
-    <w:p>
-      <w:pPr>
-        <w:spacing w:after="60"/>
-      </w:pPr>
-    </w:p>
-    <w:p>
-      <w:pPr>
-        <w:spacing w:after="100"/>
-      </w:pPr>
-      <w:r>
-        <w:rPr>
-          <w:rFonts w:ascii="Calibri" w:cs="Calibri" w:eastAsia="Calibri" w:hAnsi="Calibri"/>
-          <w:b/>
-          <w:bCs/>
-          <w:sz w:val="22"/>
-          <w:szCs w:val="22"/>
-        </w:rPr>
-        <w:t xml:space="preserve">Tabla K2 (150 µL, para 4 cristales + margen):</w:t>
-      </w:r>
-    </w:p>
-    <w:tbl>
-      <w:tblPr>
-        <w:tblW w:type="dxa" w:w="9638"/>
-        <w:tblBorders>
-          <w:top w:val="single" w:color="auto" w:sz="4"/>
-          <w:left w:val="single" w:color="auto" w:sz="4"/>
-          <w:bottom w:val="single" w:color="auto" w:sz="4"/>
-          <w:right w:val="single" w:color="auto" w:sz="4"/>
-          <w:insideH w:val="single" w:color="auto" w:sz="4"/>
-          <w:insideV w:val="single" w:color="auto" w:sz="4"/>
-        </w:tblBorders>
-      </w:tblPr>
-      <w:tblGrid>
-        <w:gridCol w:w="2400"/>
-        <w:gridCol w:w="2400"/>
-        <w:gridCol w:w="2400"/>
-        <w:gridCol w:w="2438"/>
-      </w:tblGrid>
-      <w:tr>
-        <w:tc>
-          <w:tcPr>
-            <w:tcW w:type="dxa" w:w="2400"/>
-            <w:tcBorders>
-              <w:top w:val="single" w:color="999999" w:sz="4"/>
-              <w:left w:val="single" w:color="999999" w:sz="4"/>
-              <w:bottom w:val="single" w:color="999999" w:sz="4"/>
-              <w:right w:val="single" w:color="999999" w:sz="4"/>
-            </w:tcBorders>
-            <w:shd w:fill="D9E2F3" w:color="auto" w:val="clear"/>
-            <w:tcMar>
-              <w:top w:type="dxa" w:w="60"/>
-              <w:left w:type="dxa" w:w="90"/>
-              <w:bottom w:type="dxa" w:w="60"/>
-              <w:right w:type="dxa" w:w="90"/>
-            </w:tcMar>
-          </w:tcPr>
-          <w:p>
-            <w:pPr>
-              <w:jc w:val="center"/>
-            </w:pPr>
-            <w:r>
-              <w:rPr>
-                <w:rFonts w:ascii="Calibri" w:cs="Calibri" w:eastAsia="Calibri" w:hAnsi="Calibri"/>
-                <w:b/>
-                <w:bCs/>
-                <w:sz w:val="20"/>
-                <w:szCs w:val="20"/>
-              </w:rPr>
-              <w:t xml:space="preserve">Dilución K2</w:t>
-            </w:r>
-          </w:p>
-        </w:tc>
-        <w:tc>
-          <w:tcPr>
-            <w:tcW w:type="dxa" w:w="2400"/>
-            <w:tcBorders>
-              <w:top w:val="single" w:color="999999" w:sz="4"/>
-              <w:left w:val="single" w:color="999999" w:sz="4"/>
-              <w:bottom w:val="single" w:color="999999" w:sz="4"/>
-              <w:right w:val="single" w:color="999999" w:sz="4"/>
-            </w:tcBorders>
-            <w:shd w:fill="D9E2F3" w:color="auto" w:val="clear"/>
-            <w:tcMar>
-              <w:top w:type="dxa" w:w="60"/>
-              <w:left w:type="dxa" w:w="90"/>
-              <w:bottom w:type="dxa" w:w="60"/>
-              <w:right w:type="dxa" w:w="90"/>
-            </w:tcMar>
-          </w:tcPr>
-          <w:p>
-            <w:pPr>
-              <w:jc w:val="center"/>
-            </w:pPr>
-            <w:r>
-              <w:rPr>
-                <w:rFonts w:ascii="Calibri" w:cs="Calibri" w:eastAsia="Calibri" w:hAnsi="Calibri"/>
-                <w:b/>
-                <w:bCs/>
-                <w:sz w:val="20"/>
-                <w:szCs w:val="20"/>
-              </w:rPr>
-              <w:t xml:space="preserve">Volumen total</w:t>
-            </w:r>
-          </w:p>
-        </w:tc>
-        <w:tc>
-          <w:tcPr>
-            <w:tcW w:type="dxa" w:w="2400"/>
-            <w:tcBorders>
-              <w:top w:val="single" w:color="999999" w:sz="4"/>
-              <w:left w:val="single" w:color="999999" w:sz="4"/>
-              <w:bottom w:val="single" w:color="999999" w:sz="4"/>
-              <w:right w:val="single" w:color="999999" w:sz="4"/>
-            </w:tcBorders>
-            <w:shd w:fill="D9E2F3" w:color="auto" w:val="clear"/>
-            <w:tcMar>
-              <w:top w:type="dxa" w:w="60"/>
-              <w:left w:type="dxa" w:w="90"/>
-              <w:bottom w:type="dxa" w:w="60"/>
-              <w:right w:type="dxa" w:w="90"/>
-            </w:tcMar>
-          </w:tcPr>
-          <w:p>
-            <w:pPr>
-              <w:jc w:val="center"/>
-            </w:pPr>
-            <w:r>
-              <w:rPr>
-                <w:rFonts w:ascii="Calibri" w:cs="Calibri" w:eastAsia="Calibri" w:hAnsi="Calibri"/>
-                <w:b/>
-                <w:bCs/>
-                <w:sz w:val="20"/>
-                <w:szCs w:val="20"/>
-              </w:rPr>
-              <w:t xml:space="preserve">Anticuerpo</w:t>
-            </w:r>
-          </w:p>
-        </w:tc>
-        <w:tc>
-          <w:tcPr>
-            <w:tcW w:type="dxa" w:w="2438"/>
-            <w:tcBorders>
-              <w:top w:val="single" w:color="999999" w:sz="4"/>
-              <w:left w:val="single" w:color="999999" w:sz="4"/>
-              <w:bottom w:val="single" w:color="999999" w:sz="4"/>
-              <w:right w:val="single" w:color="999999" w:sz="4"/>
-            </w:tcBorders>
-            <w:shd w:fill="D9E2F3" w:color="auto" w:val="clear"/>
-            <w:tcMar>
-              <w:top w:type="dxa" w:w="60"/>
-              <w:left w:type="dxa" w:w="90"/>
-              <w:bottom w:type="dxa" w:w="60"/>
-              <w:right w:type="dxa" w:w="90"/>
-            </w:tcMar>
-          </w:tcPr>
-          <w:p>
-            <w:pPr>
-              <w:jc w:val="center"/>
-            </w:pPr>
-            <w:r>
-              <w:rPr>
-                <w:rFonts w:ascii="Calibri" w:cs="Calibri" w:eastAsia="Calibri" w:hAnsi="Calibri"/>
-                <w:b/>
-                <w:bCs/>
-                <w:sz w:val="20"/>
-                <w:szCs w:val="20"/>
-              </w:rPr>
-              <w:t xml:space="preserve">BSA 3%</w:t>
-            </w:r>
-          </w:p>
-        </w:tc>
-      </w:tr>
-      <w:tr>
-        <w:tc>
-          <w:tcPr>
-            <w:tcW w:type="dxa" w:w="2400"/>
-            <w:tcBorders>
-              <w:top w:val="single" w:color="999999" w:sz="4"/>
-              <w:left w:val="single" w:color="999999" w:sz="4"/>
-              <w:bottom w:val="single" w:color="999999" w:sz="4"/>
-              <w:right w:val="single" w:color="999999" w:sz="4"/>
-            </w:tcBorders>
-            <w:tcMar>
-              <w:top w:type="dxa" w:w="60"/>
-              <w:left w:type="dxa" w:w="90"/>
-              <w:bottom w:type="dxa" w:w="60"/>
-              <w:right w:type="dxa" w:w="90"/>
-            </w:tcMar>
-          </w:tcPr>
-          <w:p>
-            <w:pPr>
-              <w:jc w:val="center"/>
-            </w:pPr>
-            <w:r>
-              <w:rPr>
-                <w:rFonts w:ascii="Calibri" w:cs="Calibri" w:eastAsia="Calibri" w:hAnsi="Calibri"/>
-                <w:b w:val="false"/>
-                <w:bCs w:val="false"/>
-                <w:sz w:val="20"/>
-                <w:szCs w:val="20"/>
-              </w:rPr>
-              <w:t xml:space="preserve">1:50</w:t>
-            </w:r>
-          </w:p>
-        </w:tc>
-        <w:tc>
-          <w:tcPr>
-            <w:tcW w:type="dxa" w:w="2400"/>
-            <w:tcBorders>
-              <w:top w:val="single" w:color="999999" w:sz="4"/>
-              <w:left w:val="single" w:color="999999" w:sz="4"/>
-              <w:bottom w:val="single" w:color="999999" w:sz="4"/>
-              <w:right w:val="single" w:color="999999" w:sz="4"/>
-            </w:tcBorders>
-            <w:tcMar>
-              <w:top w:type="dxa" w:w="60"/>
-              <w:left w:type="dxa" w:w="90"/>
-              <w:bottom w:type="dxa" w:w="60"/>
-              <w:right w:type="dxa" w:w="90"/>
-            </w:tcMar>
-          </w:tcPr>
-          <w:p>
-            <w:pPr>
-              <w:jc w:val="center"/>
-            </w:pPr>
-            <w:r>
-              <w:rPr>
-                <w:rFonts w:ascii="Calibri" w:cs="Calibri" w:eastAsia="Calibri" w:hAnsi="Calibri"/>
-                <w:b w:val="false"/>
-                <w:bCs w:val="false"/>
-                <w:sz w:val="20"/>
-                <w:szCs w:val="20"/>
-              </w:rPr>
-              <w:t xml:space="preserve">150 µL</w:t>
-            </w:r>
-          </w:p>
-        </w:tc>
-        <w:tc>
-          <w:tcPr>
-            <w:tcW w:type="dxa" w:w="2400"/>
-            <w:tcBorders>
-              <w:top w:val="single" w:color="999999" w:sz="4"/>
-              <w:left w:val="single" w:color="999999" w:sz="4"/>
-              <w:bottom w:val="single" w:color="999999" w:sz="4"/>
-              <w:right w:val="single" w:color="999999" w:sz="4"/>
-            </w:tcBorders>
-            <w:tcMar>
-              <w:top w:type="dxa" w:w="60"/>
-              <w:left w:type="dxa" w:w="90"/>
-              <w:bottom w:type="dxa" w:w="60"/>
-              <w:right w:type="dxa" w:w="90"/>
-            </w:tcMar>
-          </w:tcPr>
-          <w:p>
-            <w:pPr>
-              <w:jc w:val="center"/>
-            </w:pPr>
-            <w:r>
-              <w:rPr>
-                <w:rFonts w:ascii="Calibri" w:cs="Calibri" w:eastAsia="Calibri" w:hAnsi="Calibri"/>
-                <w:b w:val="false"/>
-                <w:bCs w:val="false"/>
-                <w:sz w:val="20"/>
-                <w:szCs w:val="20"/>
-              </w:rPr>
-              <w:t xml:space="preserve">3 µL</w:t>
-            </w:r>
-          </w:p>
-        </w:tc>
-        <w:tc>
-          <w:tcPr>
-            <w:tcW w:type="dxa" w:w="2438"/>
-            <w:tcBorders>
-              <w:top w:val="single" w:color="999999" w:sz="4"/>
-              <w:left w:val="single" w:color="999999" w:sz="4"/>
-              <w:bottom w:val="single" w:color="999999" w:sz="4"/>
-              <w:right w:val="single" w:color="999999" w:sz="4"/>
-            </w:tcBorders>
-            <w:tcMar>
-              <w:top w:type="dxa" w:w="60"/>
-              <w:left w:type="dxa" w:w="90"/>
-              <w:bottom w:type="dxa" w:w="60"/>
-              <w:right w:type="dxa" w:w="90"/>
-            </w:tcMar>
-          </w:tcPr>
-          <w:p>
-            <w:pPr>
-              <w:jc w:val="center"/>
-            </w:pPr>
-            <w:r>
-              <w:rPr>
-                <w:rFonts w:ascii="Calibri" w:cs="Calibri" w:eastAsia="Calibri" w:hAnsi="Calibri"/>
-                <w:b w:val="false"/>
-                <w:bCs w:val="false"/>
-                <w:sz w:val="20"/>
-                <w:szCs w:val="20"/>
-              </w:rPr>
-              <w:t xml:space="preserve">147 µL</w:t>
-            </w:r>
-          </w:p>
-        </w:tc>
-      </w:tr>
-      <w:tr>
-        <w:tc>
-          <w:tcPr>
-            <w:tcW w:type="dxa" w:w="2400"/>
-            <w:tcBorders>
-              <w:top w:val="single" w:color="999999" w:sz="4"/>
-              <w:left w:val="single" w:color="999999" w:sz="4"/>
-              <w:bottom w:val="single" w:color="999999" w:sz="4"/>
-              <w:right w:val="single" w:color="999999" w:sz="4"/>
-            </w:tcBorders>
-            <w:tcMar>
-              <w:top w:type="dxa" w:w="60"/>
-              <w:left w:type="dxa" w:w="90"/>
-              <w:bottom w:type="dxa" w:w="60"/>
-              <w:right w:type="dxa" w:w="90"/>
-            </w:tcMar>
-          </w:tcPr>
-          <w:p>
-            <w:pPr>
-              <w:jc w:val="center"/>
-            </w:pPr>
-            <w:r>
-              <w:rPr>
-                <w:rFonts w:ascii="Calibri" w:cs="Calibri" w:eastAsia="Calibri" w:hAnsi="Calibri"/>
-                <w:b w:val="false"/>
-                <w:bCs w:val="false"/>
-                <w:sz w:val="20"/>
-                <w:szCs w:val="20"/>
-              </w:rPr>
-              <w:t xml:space="preserve">1:100</w:t>
-            </w:r>
-          </w:p>
-        </w:tc>
-        <w:tc>
-          <w:tcPr>
-            <w:tcW w:type="dxa" w:w="2400"/>
-            <w:tcBorders>
-              <w:top w:val="single" w:color="999999" w:sz="4"/>
-              <w:left w:val="single" w:color="999999" w:sz="4"/>
-              <w:bottom w:val="single" w:color="999999" w:sz="4"/>
-              <w:right w:val="single" w:color="999999" w:sz="4"/>
-            </w:tcBorders>
-            <w:tcMar>
-              <w:top w:type="dxa" w:w="60"/>
-              <w:left w:type="dxa" w:w="90"/>
-              <w:bottom w:type="dxa" w:w="60"/>
-              <w:right w:type="dxa" w:w="90"/>
-            </w:tcMar>
-          </w:tcPr>
-          <w:p>
-            <w:pPr>
-              <w:jc w:val="center"/>
-            </w:pPr>
-            <w:r>
-              <w:rPr>
-                <w:rFonts w:ascii="Calibri" w:cs="Calibri" w:eastAsia="Calibri" w:hAnsi="Calibri"/>
-                <w:b w:val="false"/>
-                <w:bCs w:val="false"/>
-                <w:sz w:val="20"/>
-                <w:szCs w:val="20"/>
-              </w:rPr>
-              <w:t xml:space="preserve">150 µL</w:t>
-            </w:r>
-          </w:p>
-        </w:tc>
-        <w:tc>
-          <w:tcPr>
-            <w:tcW w:type="dxa" w:w="2400"/>
-            <w:tcBorders>
-              <w:top w:val="single" w:color="999999" w:sz="4"/>
-              <w:left w:val="single" w:color="999999" w:sz="4"/>
-              <w:bottom w:val="single" w:color="999999" w:sz="4"/>
-              <w:right w:val="single" w:color="999999" w:sz="4"/>
-            </w:tcBorders>
-            <w:tcMar>
-              <w:top w:type="dxa" w:w="60"/>
-              <w:left w:type="dxa" w:w="90"/>
-              <w:bottom w:type="dxa" w:w="60"/>
-              <w:right w:type="dxa" w:w="90"/>
-            </w:tcMar>
-          </w:tcPr>
-          <w:p>
-            <w:pPr>
-              <w:jc w:val="center"/>
-            </w:pPr>
-            <w:r>
-              <w:rPr>
-                <w:rFonts w:ascii="Calibri" w:cs="Calibri" w:eastAsia="Calibri" w:hAnsi="Calibri"/>
-                <w:b w:val="false"/>
-                <w:bCs w:val="false"/>
-                <w:sz w:val="20"/>
-                <w:szCs w:val="20"/>
-              </w:rPr>
-              <w:t xml:space="preserve">1,5 µL</w:t>
-            </w:r>
-          </w:p>
-        </w:tc>
-        <w:tc>
-          <w:tcPr>
-            <w:tcW w:type="dxa" w:w="2438"/>
-            <w:tcBorders>
-              <w:top w:val="single" w:color="999999" w:sz="4"/>
-              <w:left w:val="single" w:color="999999" w:sz="4"/>
-              <w:bottom w:val="single" w:color="999999" w:sz="4"/>
-              <w:right w:val="single" w:color="999999" w:sz="4"/>
-            </w:tcBorders>
-            <w:tcMar>
-              <w:top w:type="dxa" w:w="60"/>
-              <w:left w:type="dxa" w:w="90"/>
-              <w:bottom w:type="dxa" w:w="60"/>
-              <w:right w:type="dxa" w:w="90"/>
-            </w:tcMar>
-          </w:tcPr>
-          <w:p>
-            <w:pPr>
-              <w:jc w:val="center"/>
-            </w:pPr>
-            <w:r>
-              <w:rPr>
-                <w:rFonts w:ascii="Calibri" w:cs="Calibri" w:eastAsia="Calibri" w:hAnsi="Calibri"/>
-                <w:b w:val="false"/>
-                <w:bCs w:val="false"/>
-                <w:sz w:val="20"/>
-                <w:szCs w:val="20"/>
-              </w:rPr>
-              <w:t xml:space="preserve">148,5 µL</w:t>
-            </w:r>
-          </w:p>
-        </w:tc>
-      </w:tr>
-      <w:tr>
-        <w:tc>
-          <w:tcPr>
-            <w:tcW w:type="dxa" w:w="2400"/>
-            <w:tcBorders>
-              <w:top w:val="single" w:color="999999" w:sz="4"/>
-              <w:left w:val="single" w:color="999999" w:sz="4"/>
-              <w:bottom w:val="single" w:color="999999" w:sz="4"/>
-              <w:right w:val="single" w:color="999999" w:sz="4"/>
-            </w:tcBorders>
-            <w:tcMar>
-              <w:top w:type="dxa" w:w="60"/>
-              <w:left w:type="dxa" w:w="90"/>
-              <w:bottom w:type="dxa" w:w="60"/>
-              <w:right w:type="dxa" w:w="90"/>
-            </w:tcMar>
-          </w:tcPr>
-          <w:p>
-            <w:pPr>
-              <w:jc w:val="center"/>
-            </w:pPr>
-            <w:r>
-              <w:rPr>
-                <w:rFonts w:ascii="Calibri" w:cs="Calibri" w:eastAsia="Calibri" w:hAnsi="Calibri"/>
-                <w:b w:val="false"/>
-                <w:bCs w:val="false"/>
-                <w:sz w:val="20"/>
-                <w:szCs w:val="20"/>
-              </w:rPr>
-              <w:t xml:space="preserve">1:200</w:t>
-            </w:r>
-          </w:p>
-        </w:tc>
-        <w:tc>
-          <w:tcPr>
-            <w:tcW w:type="dxa" w:w="2400"/>
-            <w:tcBorders>
-              <w:top w:val="single" w:color="999999" w:sz="4"/>
-              <w:left w:val="single" w:color="999999" w:sz="4"/>
-              <w:bottom w:val="single" w:color="999999" w:sz="4"/>
-              <w:right w:val="single" w:color="999999" w:sz="4"/>
-            </w:tcBorders>
-            <w:tcMar>
-              <w:top w:type="dxa" w:w="60"/>
-              <w:left w:type="dxa" w:w="90"/>
-              <w:bottom w:type="dxa" w:w="60"/>
-              <w:right w:type="dxa" w:w="90"/>
-            </w:tcMar>
-          </w:tcPr>
-          <w:p>
-            <w:pPr>
-              <w:jc w:val="center"/>
-            </w:pPr>
-            <w:r>
-              <w:rPr>
-                <w:rFonts w:ascii="Calibri" w:cs="Calibri" w:eastAsia="Calibri" w:hAnsi="Calibri"/>
-                <w:b w:val="false"/>
-                <w:bCs w:val="false"/>
-                <w:sz w:val="20"/>
-                <w:szCs w:val="20"/>
-              </w:rPr>
-              <w:t xml:space="preserve">150 µL</w:t>
-            </w:r>
-          </w:p>
-        </w:tc>
-        <w:tc>
-          <w:tcPr>
-            <w:tcW w:type="dxa" w:w="2400"/>
-            <w:tcBorders>
-              <w:top w:val="single" w:color="999999" w:sz="4"/>
-              <w:left w:val="single" w:color="999999" w:sz="4"/>
-              <w:bottom w:val="single" w:color="999999" w:sz="4"/>
-              <w:right w:val="single" w:color="999999" w:sz="4"/>
-            </w:tcBorders>
-            <w:tcMar>
-              <w:top w:type="dxa" w:w="60"/>
-              <w:left w:type="dxa" w:w="90"/>
-              <w:bottom w:type="dxa" w:w="60"/>
-              <w:right w:type="dxa" w:w="90"/>
-            </w:tcMar>
-          </w:tcPr>
-          <w:p>
-            <w:pPr>
-              <w:jc w:val="center"/>
-            </w:pPr>
-            <w:r>
-              <w:rPr>
-                <w:rFonts w:ascii="Calibri" w:cs="Calibri" w:eastAsia="Calibri" w:hAnsi="Calibri"/>
-                <w:b w:val="false"/>
-                <w:bCs w:val="false"/>
-                <w:sz w:val="20"/>
-                <w:szCs w:val="20"/>
-              </w:rPr>
-              <w:t xml:space="preserve">0,75 µL</w:t>
-            </w:r>
-          </w:p>
-        </w:tc>
-        <w:tc>
-          <w:tcPr>
-            <w:tcW w:type="dxa" w:w="2438"/>
-            <w:tcBorders>
-              <w:top w:val="single" w:color="999999" w:sz="4"/>
-              <w:left w:val="single" w:color="999999" w:sz="4"/>
-              <w:bottom w:val="single" w:color="999999" w:sz="4"/>
-              <w:right w:val="single" w:color="999999" w:sz="4"/>
-            </w:tcBorders>
-            <w:tcMar>
-              <w:top w:type="dxa" w:w="60"/>
-              <w:left w:type="dxa" w:w="90"/>
-              <w:bottom w:type="dxa" w:w="60"/>
-              <w:right w:type="dxa" w:w="90"/>
-            </w:tcMar>
-          </w:tcPr>
-          <w:p>
-            <w:pPr>
-              <w:jc w:val="center"/>
-            </w:pPr>
-            <w:r>
-              <w:rPr>
-                <w:rFonts w:ascii="Calibri" w:cs="Calibri" w:eastAsia="Calibri" w:hAnsi="Calibri"/>
-                <w:b w:val="false"/>
-                <w:bCs w:val="false"/>
-                <w:sz w:val="20"/>
-                <w:szCs w:val="20"/>
-              </w:rPr>
-              <w:t xml:space="preserve">149,25 µL</w:t>
-            </w:r>
-          </w:p>
-        </w:tc>
-      </w:tr>
-      <w:tr>
-        <w:tc>
-          <w:tcPr>
-            <w:tcW w:type="dxa" w:w="2400"/>
-            <w:tcBorders>
-              <w:top w:val="single" w:color="999999" w:sz="4"/>
-              <w:left w:val="single" w:color="999999" w:sz="4"/>
-              <w:bottom w:val="single" w:color="999999" w:sz="4"/>
-              <w:right w:val="single" w:color="999999" w:sz="4"/>
-            </w:tcBorders>
-            <w:tcMar>
-              <w:top w:type="dxa" w:w="60"/>
-              <w:left w:type="dxa" w:w="90"/>
-              <w:bottom w:type="dxa" w:w="60"/>
-              <w:right w:type="dxa" w:w="90"/>
-            </w:tcMar>
-          </w:tcPr>
-          <w:p>
-            <w:pPr>
-              <w:jc w:val="center"/>
-            </w:pPr>
-            <w:r>
-              <w:rPr>
-                <w:rFonts w:ascii="Calibri" w:cs="Calibri" w:eastAsia="Calibri" w:hAnsi="Calibri"/>
-                <w:b w:val="false"/>
-                <w:bCs w:val="false"/>
-                <w:sz w:val="20"/>
-                <w:szCs w:val="20"/>
-              </w:rPr>
-              <w:t xml:space="preserve">1:500</w:t>
-            </w:r>
-          </w:p>
-        </w:tc>
-        <w:tc>
-          <w:tcPr>
-            <w:tcW w:type="dxa" w:w="2400"/>
-            <w:tcBorders>
-              <w:top w:val="single" w:color="999999" w:sz="4"/>
-              <w:left w:val="single" w:color="999999" w:sz="4"/>
-              <w:bottom w:val="single" w:color="999999" w:sz="4"/>
-              <w:right w:val="single" w:color="999999" w:sz="4"/>
-            </w:tcBorders>
-            <w:tcMar>
-              <w:top w:type="dxa" w:w="60"/>
-              <w:left w:type="dxa" w:w="90"/>
-              <w:bottom w:type="dxa" w:w="60"/>
-              <w:right w:type="dxa" w:w="90"/>
-            </w:tcMar>
-          </w:tcPr>
-          <w:p>
-            <w:pPr>
-              <w:jc w:val="center"/>
-            </w:pPr>
-            <w:r>
-              <w:rPr>
-                <w:rFonts w:ascii="Calibri" w:cs="Calibri" w:eastAsia="Calibri" w:hAnsi="Calibri"/>
-                <w:b w:val="false"/>
-                <w:bCs w:val="false"/>
-                <w:sz w:val="20"/>
-                <w:szCs w:val="20"/>
-              </w:rPr>
-              <w:t xml:space="preserve">250 µL</w:t>
-            </w:r>
-          </w:p>
-        </w:tc>
-        <w:tc>
-          <w:tcPr>
-            <w:tcW w:type="dxa" w:w="2400"/>
-            <w:tcBorders>
-              <w:top w:val="single" w:color="999999" w:sz="4"/>
-              <w:left w:val="single" w:color="999999" w:sz="4"/>
-              <w:bottom w:val="single" w:color="999999" w:sz="4"/>
-              <w:right w:val="single" w:color="999999" w:sz="4"/>
-            </w:tcBorders>
-            <w:tcMar>
-              <w:top w:type="dxa" w:w="60"/>
-              <w:left w:type="dxa" w:w="90"/>
-              <w:bottom w:type="dxa" w:w="60"/>
-              <w:right w:type="dxa" w:w="90"/>
-            </w:tcMar>
-          </w:tcPr>
-          <w:p>
-            <w:pPr>
-              <w:jc w:val="center"/>
-            </w:pPr>
-            <w:r>
-              <w:rPr>
-                <w:rFonts w:ascii="Calibri" w:cs="Calibri" w:eastAsia="Calibri" w:hAnsi="Calibri"/>
-                <w:b w:val="false"/>
-                <w:bCs w:val="false"/>
-                <w:sz w:val="20"/>
-                <w:szCs w:val="20"/>
-              </w:rPr>
-              <w:t xml:space="preserve">0,5 µL</w:t>
-            </w:r>
-          </w:p>
-        </w:tc>
-        <w:tc>
-          <w:tcPr>
-            <w:tcW w:type="dxa" w:w="2438"/>
-            <w:tcBorders>
-              <w:top w:val="single" w:color="999999" w:sz="4"/>
-              <w:left w:val="single" w:color="999999" w:sz="4"/>
-              <w:bottom w:val="single" w:color="999999" w:sz="4"/>
-              <w:right w:val="single" w:color="999999" w:sz="4"/>
-            </w:tcBorders>
-            <w:tcMar>
-              <w:top w:type="dxa" w:w="60"/>
-              <w:left w:type="dxa" w:w="90"/>
-              <w:bottom w:type="dxa" w:w="60"/>
-              <w:right w:type="dxa" w:w="90"/>
-            </w:tcMar>
-          </w:tcPr>
-          <w:p>
-            <w:pPr>
-              <w:jc w:val="center"/>
-            </w:pPr>
-            <w:r>
-              <w:rPr>
-                <w:rFonts w:ascii="Calibri" w:cs="Calibri" w:eastAsia="Calibri" w:hAnsi="Calibri"/>
-                <w:b w:val="false"/>
-                <w:bCs w:val="false"/>
-                <w:sz w:val="20"/>
-                <w:szCs w:val="20"/>
-              </w:rPr>
-              <w:t xml:space="preserve">249,5 µL</w:t>
+        <w:tc>
+          <w:tcPr>
+            <w:tcW w:type="dxa" w:w="2038"/>
+            <w:tcBorders>
+              <w:top w:val="single" w:color="999999" w:sz="4"/>
+              <w:left w:val="single" w:color="999999" w:sz="4"/>
+              <w:bottom w:val="single" w:color="999999" w:sz="4"/>
+              <w:right w:val="single" w:color="999999" w:sz="4"/>
+            </w:tcBorders>
+            <w:tcMar>
+              <w:top w:type="dxa" w:w="60"/>
+              <w:left w:type="dxa" w:w="90"/>
+              <w:bottom w:type="dxa" w:w="60"/>
+              <w:right w:type="dxa" w:w="90"/>
+            </w:tcMar>
+          </w:tcPr>
+          <w:p>
+            <w:pPr>
+              <w:jc w:val="center"/>
+            </w:pPr>
+            <w:r>
+              <w:rPr>
+                <w:rFonts w:ascii="Calibri" w:cs="Calibri" w:eastAsia="Calibri" w:hAnsi="Calibri"/>
+                <w:b w:val="false"/>
+                <w:bCs w:val="false"/>
+                <w:sz w:val="20"/>
+                <w:szCs w:val="20"/>
+              </w:rPr>
+              <w:t xml:space="preserve">—</w:t>
             </w:r>
           </w:p>
         </w:tc>
@@ -6597,17 +6137,18 @@
         </w:tblBorders>
       </w:tblPr>
       <w:tblGrid>
-        <w:gridCol w:w="2000"/>
+        <w:gridCol w:w="1700"/>
+        <w:gridCol w:w="900"/>
+        <w:gridCol w:w="2300"/>
         <w:gridCol w:w="1100"/>
-        <w:gridCol w:w="2000"/>
         <w:gridCol w:w="1300"/>
-        <w:gridCol w:w="1500"/>
-        <w:gridCol w:w="1738"/>
+        <w:gridCol w:w="1300"/>
+        <w:gridCol w:w="1038"/>
       </w:tblGrid>
       <w:tr>
         <w:tc>
           <w:tcPr>
-            <w:tcW w:type="dxa" w:w="2000"/>
+            <w:tcW w:type="dxa" w:w="1700"/>
             <w:tcBorders>
               <w:top w:val="single" w:color="999999" w:sz="4"/>
               <w:left w:val="single" w:color="999999" w:sz="4"/>
@@ -6640,7 +6181,7 @@
         </w:tc>
         <w:tc>
           <w:tcPr>
-            <w:tcW w:type="dxa" w:w="1100"/>
+            <w:tcW w:type="dxa" w:w="900"/>
             <w:tcBorders>
               <w:top w:val="single" w:color="999999" w:sz="4"/>
               <w:left w:val="single" w:color="999999" w:sz="4"/>
@@ -6673,7 +6214,7 @@
         </w:tc>
         <w:tc>
           <w:tcPr>
-            <w:tcW w:type="dxa" w:w="2000"/>
+            <w:tcW w:type="dxa" w:w="2300"/>
             <w:tcBorders>
               <w:top w:val="single" w:color="999999" w:sz="4"/>
               <w:left w:val="single" w:color="999999" w:sz="4"/>
@@ -6706,7 +6247,7 @@
         </w:tc>
         <w:tc>
           <w:tcPr>
-            <w:tcW w:type="dxa" w:w="1300"/>
+            <w:tcW w:type="dxa" w:w="1100"/>
             <w:tcBorders>
               <w:top w:val="single" w:color="999999" w:sz="4"/>
               <w:left w:val="single" w:color="999999" w:sz="4"/>
@@ -6733,13 +6274,13 @@
                 <w:sz w:val="20"/>
                 <w:szCs w:val="20"/>
               </w:rPr>
-              <w:t xml:space="preserve">Volumen a preparar</w:t>
-            </w:r>
-          </w:p>
-        </w:tc>
-        <w:tc>
-          <w:tcPr>
-            <w:tcW w:type="dxa" w:w="1500"/>
+              <w:t xml:space="preserve">Necesario</w:t>
+            </w:r>
+          </w:p>
+        </w:tc>
+        <w:tc>
+          <w:tcPr>
+            <w:tcW w:type="dxa" w:w="1300"/>
             <w:tcBorders>
               <w:top w:val="single" w:color="999999" w:sz="4"/>
               <w:left w:val="single" w:color="999999" w:sz="4"/>
@@ -6766,13 +6307,13 @@
                 <w:sz w:val="20"/>
                 <w:szCs w:val="20"/>
               </w:rPr>
-              <w:t xml:space="preserve">Secundario</w:t>
-            </w:r>
-          </w:p>
-        </w:tc>
-        <w:tc>
-          <w:tcPr>
-            <w:tcW w:type="dxa" w:w="1738"/>
+              <w:t xml:space="preserve">Volumen a preparar</w:t>
+            </w:r>
+          </w:p>
+        </w:tc>
+        <w:tc>
+          <w:tcPr>
+            <w:tcW w:type="dxa" w:w="1300"/>
             <w:tcBorders>
               <w:top w:val="single" w:color="999999" w:sz="4"/>
               <w:left w:val="single" w:color="999999" w:sz="4"/>
@@ -6799,7 +6340,40 @@
                 <w:sz w:val="20"/>
                 <w:szCs w:val="20"/>
               </w:rPr>
-              <w:t xml:space="preserve">BSA 1%</w:t>
+              <w:t xml:space="preserve">Secundario + BSA 1%</w:t>
+            </w:r>
+          </w:p>
+        </w:tc>
+        <w:tc>
+          <w:tcPr>
+            <w:tcW w:type="dxa" w:w="1038"/>
+            <w:tcBorders>
+              <w:top w:val="single" w:color="999999" w:sz="4"/>
+              <w:left w:val="single" w:color="999999" w:sz="4"/>
+              <w:bottom w:val="single" w:color="999999" w:sz="4"/>
+              <w:right w:val="single" w:color="999999" w:sz="4"/>
+            </w:tcBorders>
+            <w:shd w:fill="D9E2F3" w:color="auto" w:val="clear"/>
+            <w:tcMar>
+              <w:top w:type="dxa" w:w="60"/>
+              <w:left w:type="dxa" w:w="90"/>
+              <w:bottom w:type="dxa" w:w="60"/>
+              <w:right w:type="dxa" w:w="90"/>
+            </w:tcMar>
+          </w:tcPr>
+          <w:p>
+            <w:pPr>
+              <w:jc w:val="center"/>
+            </w:pPr>
+            <w:r>
+              <w:rPr>
+                <w:rFonts w:ascii="Calibri" w:cs="Calibri" w:eastAsia="Calibri" w:hAnsi="Calibri"/>
+                <w:b/>
+                <w:bCs/>
+                <w:sz w:val="20"/>
+                <w:szCs w:val="20"/>
+              </w:rPr>
+              <w:t xml:space="preserve">Margen real</w:t>
             </w:r>
           </w:p>
         </w:tc>
@@ -6807,7 +6381,7 @@
       <w:tr>
         <w:tc>
           <w:tcPr>
-            <w:tcW w:type="dxa" w:w="2000"/>
+            <w:tcW w:type="dxa" w:w="1700"/>
             <w:tcBorders>
               <w:top w:val="single" w:color="999999" w:sz="4"/>
               <w:left w:val="single" w:color="999999" w:sz="4"/>
@@ -6839,6 +6413,70 @@
         </w:tc>
         <w:tc>
           <w:tcPr>
+            <w:tcW w:type="dxa" w:w="900"/>
+            <w:tcBorders>
+              <w:top w:val="single" w:color="999999" w:sz="4"/>
+              <w:left w:val="single" w:color="999999" w:sz="4"/>
+              <w:bottom w:val="single" w:color="999999" w:sz="4"/>
+              <w:right w:val="single" w:color="999999" w:sz="4"/>
+            </w:tcBorders>
+            <w:tcMar>
+              <w:top w:type="dxa" w:w="60"/>
+              <w:left w:type="dxa" w:w="90"/>
+              <w:bottom w:type="dxa" w:w="60"/>
+              <w:right w:type="dxa" w:w="90"/>
+            </w:tcMar>
+          </w:tcPr>
+          <w:p>
+            <w:pPr>
+              <w:jc w:val="center"/>
+            </w:pPr>
+            <w:r>
+              <w:rPr>
+                <w:rFonts w:ascii="Calibri" w:cs="Calibri" w:eastAsia="Calibri" w:hAnsi="Calibri"/>
+                <w:b w:val="false"/>
+                <w:bCs w:val="false"/>
+                <w:sz w:val="20"/>
+                <w:szCs w:val="20"/>
+              </w:rPr>
+              <w:t xml:space="preserve">1:500</w:t>
+            </w:r>
+          </w:p>
+        </w:tc>
+        <w:tc>
+          <w:tcPr>
+            <w:tcW w:type="dxa" w:w="2300"/>
+            <w:tcBorders>
+              <w:top w:val="single" w:color="999999" w:sz="4"/>
+              <w:left w:val="single" w:color="999999" w:sz="4"/>
+              <w:bottom w:val="single" w:color="999999" w:sz="4"/>
+              <w:right w:val="single" w:color="999999" w:sz="4"/>
+            </w:tcBorders>
+            <w:tcMar>
+              <w:top w:type="dxa" w:w="60"/>
+              <w:left w:type="dxa" w:w="90"/>
+              <w:bottom w:type="dxa" w:w="60"/>
+              <w:right w:type="dxa" w:w="90"/>
+            </w:tcMar>
+          </w:tcPr>
+          <w:p>
+            <w:pPr>
+              <w:jc w:val="center"/>
+            </w:pPr>
+            <w:r>
+              <w:rPr>
+                <w:rFonts w:ascii="Calibri" w:cs="Calibri" w:eastAsia="Calibri" w:hAnsi="Calibri"/>
+                <w:b w:val="false"/>
+                <w:bCs w:val="false"/>
+                <w:sz w:val="20"/>
+                <w:szCs w:val="20"/>
+              </w:rPr>
+              <w:t xml:space="preserve">K1 4 + K2 4 + K5 4 + K14 4 + C- rabbit 2 = 18</w:t>
+            </w:r>
+          </w:p>
+        </w:tc>
+        <w:tc>
+          <w:tcPr>
             <w:tcW w:type="dxa" w:w="1100"/>
             <w:tcBorders>
               <w:top w:val="single" w:color="999999" w:sz="4"/>
@@ -6865,39 +6503,7 @@
                 <w:sz w:val="20"/>
                 <w:szCs w:val="20"/>
               </w:rPr>
-              <w:t xml:space="preserve">1:500</w:t>
-            </w:r>
-          </w:p>
-        </w:tc>
-        <w:tc>
-          <w:tcPr>
-            <w:tcW w:type="dxa" w:w="2000"/>
-            <w:tcBorders>
-              <w:top w:val="single" w:color="999999" w:sz="4"/>
-              <w:left w:val="single" w:color="999999" w:sz="4"/>
-              <w:bottom w:val="single" w:color="999999" w:sz="4"/>
-              <w:right w:val="single" w:color="999999" w:sz="4"/>
-            </w:tcBorders>
-            <w:tcMar>
-              <w:top w:type="dxa" w:w="60"/>
-              <w:left w:type="dxa" w:w="90"/>
-              <w:bottom w:type="dxa" w:w="60"/>
-              <w:right w:type="dxa" w:w="90"/>
-            </w:tcMar>
-          </w:tcPr>
-          <w:p>
-            <w:pPr>
-              <w:jc w:val="center"/>
-            </w:pPr>
-            <w:r>
-              <w:rPr>
-                <w:rFonts w:ascii="Calibri" w:cs="Calibri" w:eastAsia="Calibri" w:hAnsi="Calibri"/>
-                <w:b w:val="false"/>
-                <w:bCs w:val="false"/>
-                <w:sz w:val="20"/>
-                <w:szCs w:val="20"/>
-              </w:rPr>
-              <w:t xml:space="preserve">K1 4 + K5 4 + K14 4 + C- rabbit 2 = 14</w:t>
+              <w:t xml:space="preserve">540 µL</w:t>
             </w:r>
           </w:p>
         </w:tc>
@@ -6929,71 +6535,71 @@
                 <w:sz w:val="20"/>
                 <w:szCs w:val="20"/>
               </w:rPr>
-              <w:t xml:space="preserve">500 µL</w:t>
-            </w:r>
-          </w:p>
-        </w:tc>
-        <w:tc>
-          <w:tcPr>
-            <w:tcW w:type="dxa" w:w="1500"/>
-            <w:tcBorders>
-              <w:top w:val="single" w:color="999999" w:sz="4"/>
-              <w:left w:val="single" w:color="999999" w:sz="4"/>
-              <w:bottom w:val="single" w:color="999999" w:sz="4"/>
-              <w:right w:val="single" w:color="999999" w:sz="4"/>
-            </w:tcBorders>
-            <w:tcMar>
-              <w:top w:type="dxa" w:w="60"/>
-              <w:left w:type="dxa" w:w="90"/>
-              <w:bottom w:type="dxa" w:w="60"/>
-              <w:right w:type="dxa" w:w="90"/>
-            </w:tcMar>
-          </w:tcPr>
-          <w:p>
-            <w:pPr>
-              <w:jc w:val="center"/>
-            </w:pPr>
-            <w:r>
-              <w:rPr>
-                <w:rFonts w:ascii="Calibri" w:cs="Calibri" w:eastAsia="Calibri" w:hAnsi="Calibri"/>
-                <w:b w:val="false"/>
-                <w:bCs w:val="false"/>
-                <w:sz w:val="20"/>
-                <w:szCs w:val="20"/>
-              </w:rPr>
-              <w:t xml:space="preserve">1 µL</w:t>
-            </w:r>
-          </w:p>
-        </w:tc>
-        <w:tc>
-          <w:tcPr>
-            <w:tcW w:type="dxa" w:w="1738"/>
-            <w:tcBorders>
-              <w:top w:val="single" w:color="999999" w:sz="4"/>
-              <w:left w:val="single" w:color="999999" w:sz="4"/>
-              <w:bottom w:val="single" w:color="999999" w:sz="4"/>
-              <w:right w:val="single" w:color="999999" w:sz="4"/>
-            </w:tcBorders>
-            <w:tcMar>
-              <w:top w:type="dxa" w:w="60"/>
-              <w:left w:type="dxa" w:w="90"/>
-              <w:bottom w:type="dxa" w:w="60"/>
-              <w:right w:type="dxa" w:w="90"/>
-            </w:tcMar>
-          </w:tcPr>
-          <w:p>
-            <w:pPr>
-              <w:jc w:val="center"/>
-            </w:pPr>
-            <w:r>
-              <w:rPr>
-                <w:rFonts w:ascii="Calibri" w:cs="Calibri" w:eastAsia="Calibri" w:hAnsi="Calibri"/>
-                <w:b w:val="false"/>
-                <w:bCs w:val="false"/>
-                <w:sz w:val="20"/>
-                <w:szCs w:val="20"/>
-              </w:rPr>
-              <w:t xml:space="preserve">499 µL</w:t>
+              <w:t xml:space="preserve">600 µL</w:t>
+            </w:r>
+          </w:p>
+        </w:tc>
+        <w:tc>
+          <w:tcPr>
+            <w:tcW w:type="dxa" w:w="1300"/>
+            <w:tcBorders>
+              <w:top w:val="single" w:color="999999" w:sz="4"/>
+              <w:left w:val="single" w:color="999999" w:sz="4"/>
+              <w:bottom w:val="single" w:color="999999" w:sz="4"/>
+              <w:right w:val="single" w:color="999999" w:sz="4"/>
+            </w:tcBorders>
+            <w:tcMar>
+              <w:top w:type="dxa" w:w="60"/>
+              <w:left w:type="dxa" w:w="90"/>
+              <w:bottom w:type="dxa" w:w="60"/>
+              <w:right w:type="dxa" w:w="90"/>
+            </w:tcMar>
+          </w:tcPr>
+          <w:p>
+            <w:pPr>
+              <w:jc w:val="center"/>
+            </w:pPr>
+            <w:r>
+              <w:rPr>
+                <w:rFonts w:ascii="Calibri" w:cs="Calibri" w:eastAsia="Calibri" w:hAnsi="Calibri"/>
+                <w:b w:val="false"/>
+                <w:bCs w:val="false"/>
+                <w:sz w:val="20"/>
+                <w:szCs w:val="20"/>
+              </w:rPr>
+              <w:t xml:space="preserve">1,2 µL + 598,8 µL</w:t>
+            </w:r>
+          </w:p>
+        </w:tc>
+        <w:tc>
+          <w:tcPr>
+            <w:tcW w:type="dxa" w:w="1038"/>
+            <w:tcBorders>
+              <w:top w:val="single" w:color="999999" w:sz="4"/>
+              <w:left w:val="single" w:color="999999" w:sz="4"/>
+              <w:bottom w:val="single" w:color="999999" w:sz="4"/>
+              <w:right w:val="single" w:color="999999" w:sz="4"/>
+            </w:tcBorders>
+            <w:tcMar>
+              <w:top w:type="dxa" w:w="60"/>
+              <w:left w:type="dxa" w:w="90"/>
+              <w:bottom w:type="dxa" w:w="60"/>
+              <w:right w:type="dxa" w:w="90"/>
+            </w:tcMar>
+          </w:tcPr>
+          <w:p>
+            <w:pPr>
+              <w:jc w:val="center"/>
+            </w:pPr>
+            <w:r>
+              <w:rPr>
+                <w:rFonts w:ascii="Calibri" w:cs="Calibri" w:eastAsia="Calibri" w:hAnsi="Calibri"/>
+                <w:b w:val="false"/>
+                <w:bCs w:val="false"/>
+                <w:sz w:val="20"/>
+                <w:szCs w:val="20"/>
+              </w:rPr>
+              <w:t xml:space="preserve">+11%</w:t>
             </w:r>
           </w:p>
         </w:tc>
@@ -7001,7 +6607,7 @@
       <w:tr>
         <w:tc>
           <w:tcPr>
-            <w:tcW w:type="dxa" w:w="2000"/>
+            <w:tcW w:type="dxa" w:w="1700"/>
             <w:tcBorders>
               <w:top w:val="single" w:color="999999" w:sz="4"/>
               <w:left w:val="single" w:color="999999" w:sz="4"/>
@@ -7033,6 +6639,70 @@
         </w:tc>
         <w:tc>
           <w:tcPr>
+            <w:tcW w:type="dxa" w:w="900"/>
+            <w:tcBorders>
+              <w:top w:val="single" w:color="999999" w:sz="4"/>
+              <w:left w:val="single" w:color="999999" w:sz="4"/>
+              <w:bottom w:val="single" w:color="999999" w:sz="4"/>
+              <w:right w:val="single" w:color="999999" w:sz="4"/>
+            </w:tcBorders>
+            <w:tcMar>
+              <w:top w:type="dxa" w:w="60"/>
+              <w:left w:type="dxa" w:w="90"/>
+              <w:bottom w:type="dxa" w:w="60"/>
+              <w:right w:type="dxa" w:w="90"/>
+            </w:tcMar>
+          </w:tcPr>
+          <w:p>
+            <w:pPr>
+              <w:jc w:val="center"/>
+            </w:pPr>
+            <w:r>
+              <w:rPr>
+                <w:rFonts w:ascii="Calibri" w:cs="Calibri" w:eastAsia="Calibri" w:hAnsi="Calibri"/>
+                <w:b w:val="false"/>
+                <w:bCs w:val="false"/>
+                <w:sz w:val="20"/>
+                <w:szCs w:val="20"/>
+              </w:rPr>
+              <w:t xml:space="preserve">1:400</w:t>
+            </w:r>
+          </w:p>
+        </w:tc>
+        <w:tc>
+          <w:tcPr>
+            <w:tcW w:type="dxa" w:w="2300"/>
+            <w:tcBorders>
+              <w:top w:val="single" w:color="999999" w:sz="4"/>
+              <w:left w:val="single" w:color="999999" w:sz="4"/>
+              <w:bottom w:val="single" w:color="999999" w:sz="4"/>
+              <w:right w:val="single" w:color="999999" w:sz="4"/>
+            </w:tcBorders>
+            <w:tcMar>
+              <w:top w:type="dxa" w:w="60"/>
+              <w:left w:type="dxa" w:w="90"/>
+              <w:bottom w:type="dxa" w:w="60"/>
+              <w:right w:type="dxa" w:w="90"/>
+            </w:tcMar>
+          </w:tcPr>
+          <w:p>
+            <w:pPr>
+              <w:jc w:val="center"/>
+            </w:pPr>
+            <w:r>
+              <w:rPr>
+                <w:rFonts w:ascii="Calibri" w:cs="Calibri" w:eastAsia="Calibri" w:hAnsi="Calibri"/>
+                <w:b w:val="false"/>
+                <w:bCs w:val="false"/>
+                <w:sz w:val="20"/>
+                <w:szCs w:val="20"/>
+              </w:rPr>
+              <w:t xml:space="preserve">K10 6 + C- mouse 2 = 8</w:t>
+            </w:r>
+          </w:p>
+        </w:tc>
+        <w:tc>
+          <w:tcPr>
             <w:tcW w:type="dxa" w:w="1100"/>
             <w:tcBorders>
               <w:top w:val="single" w:color="999999" w:sz="4"/>
@@ -7059,39 +6729,7 @@
                 <w:sz w:val="20"/>
                 <w:szCs w:val="20"/>
               </w:rPr>
-              <w:t xml:space="preserve">1:400</w:t>
-            </w:r>
-          </w:p>
-        </w:tc>
-        <w:tc>
-          <w:tcPr>
-            <w:tcW w:type="dxa" w:w="2000"/>
-            <w:tcBorders>
-              <w:top w:val="single" w:color="999999" w:sz="4"/>
-              <w:left w:val="single" w:color="999999" w:sz="4"/>
-              <w:bottom w:val="single" w:color="999999" w:sz="4"/>
-              <w:right w:val="single" w:color="999999" w:sz="4"/>
-            </w:tcBorders>
-            <w:tcMar>
-              <w:top w:type="dxa" w:w="60"/>
-              <w:left w:type="dxa" w:w="90"/>
-              <w:bottom w:type="dxa" w:w="60"/>
-              <w:right w:type="dxa" w:w="90"/>
-            </w:tcMar>
-          </w:tcPr>
-          <w:p>
-            <w:pPr>
-              <w:jc w:val="center"/>
-            </w:pPr>
-            <w:r>
-              <w:rPr>
-                <w:rFonts w:ascii="Calibri" w:cs="Calibri" w:eastAsia="Calibri" w:hAnsi="Calibri"/>
-                <w:b w:val="false"/>
-                <w:bCs w:val="false"/>
-                <w:sz w:val="20"/>
-                <w:szCs w:val="20"/>
-              </w:rPr>
-              <w:t xml:space="preserve">K10 6 + C- mouse 2 = 8</w:t>
+              <w:t xml:space="preserve">240 µL</w:t>
             </w:r>
           </w:p>
         </w:tc>
@@ -7123,71 +6761,71 @@
                 <w:sz w:val="20"/>
                 <w:szCs w:val="20"/>
               </w:rPr>
-              <w:t xml:space="preserve">400 µL</w:t>
-            </w:r>
-          </w:p>
-        </w:tc>
-        <w:tc>
-          <w:tcPr>
-            <w:tcW w:type="dxa" w:w="1500"/>
-            <w:tcBorders>
-              <w:top w:val="single" w:color="999999" w:sz="4"/>
-              <w:left w:val="single" w:color="999999" w:sz="4"/>
-              <w:bottom w:val="single" w:color="999999" w:sz="4"/>
-              <w:right w:val="single" w:color="999999" w:sz="4"/>
-            </w:tcBorders>
-            <w:tcMar>
-              <w:top w:type="dxa" w:w="60"/>
-              <w:left w:type="dxa" w:w="90"/>
-              <w:bottom w:type="dxa" w:w="60"/>
-              <w:right w:type="dxa" w:w="90"/>
-            </w:tcMar>
-          </w:tcPr>
-          <w:p>
-            <w:pPr>
-              <w:jc w:val="center"/>
-            </w:pPr>
-            <w:r>
-              <w:rPr>
-                <w:rFonts w:ascii="Calibri" w:cs="Calibri" w:eastAsia="Calibri" w:hAnsi="Calibri"/>
-                <w:b w:val="false"/>
-                <w:bCs w:val="false"/>
-                <w:sz w:val="20"/>
-                <w:szCs w:val="20"/>
-              </w:rPr>
-              <w:t xml:space="preserve">1 µL</w:t>
-            </w:r>
-          </w:p>
-        </w:tc>
-        <w:tc>
-          <w:tcPr>
-            <w:tcW w:type="dxa" w:w="1738"/>
-            <w:tcBorders>
-              <w:top w:val="single" w:color="999999" w:sz="4"/>
-              <w:left w:val="single" w:color="999999" w:sz="4"/>
-              <w:bottom w:val="single" w:color="999999" w:sz="4"/>
-              <w:right w:val="single" w:color="999999" w:sz="4"/>
-            </w:tcBorders>
-            <w:tcMar>
-              <w:top w:type="dxa" w:w="60"/>
-              <w:left w:type="dxa" w:w="90"/>
-              <w:bottom w:type="dxa" w:w="60"/>
-              <w:right w:type="dxa" w:w="90"/>
-            </w:tcMar>
-          </w:tcPr>
-          <w:p>
-            <w:pPr>
-              <w:jc w:val="center"/>
-            </w:pPr>
-            <w:r>
-              <w:rPr>
-                <w:rFonts w:ascii="Calibri" w:cs="Calibri" w:eastAsia="Calibri" w:hAnsi="Calibri"/>
-                <w:b w:val="false"/>
-                <w:bCs w:val="false"/>
-                <w:sz w:val="20"/>
-                <w:szCs w:val="20"/>
-              </w:rPr>
-              <w:t xml:space="preserve">399 µL</w:t>
+              <w:t xml:space="preserve">264 µL</w:t>
+            </w:r>
+          </w:p>
+        </w:tc>
+        <w:tc>
+          <w:tcPr>
+            <w:tcW w:type="dxa" w:w="1300"/>
+            <w:tcBorders>
+              <w:top w:val="single" w:color="999999" w:sz="4"/>
+              <w:left w:val="single" w:color="999999" w:sz="4"/>
+              <w:bottom w:val="single" w:color="999999" w:sz="4"/>
+              <w:right w:val="single" w:color="999999" w:sz="4"/>
+            </w:tcBorders>
+            <w:tcMar>
+              <w:top w:type="dxa" w:w="60"/>
+              <w:left w:type="dxa" w:w="90"/>
+              <w:bottom w:type="dxa" w:w="60"/>
+              <w:right w:type="dxa" w:w="90"/>
+            </w:tcMar>
+          </w:tcPr>
+          <w:p>
+            <w:pPr>
+              <w:jc w:val="center"/>
+            </w:pPr>
+            <w:r>
+              <w:rPr>
+                <w:rFonts w:ascii="Calibri" w:cs="Calibri" w:eastAsia="Calibri" w:hAnsi="Calibri"/>
+                <w:b w:val="false"/>
+                <w:bCs w:val="false"/>
+                <w:sz w:val="20"/>
+                <w:szCs w:val="20"/>
+              </w:rPr>
+              <w:t xml:space="preserve">0,66 µL + 263,3 µL</w:t>
+            </w:r>
+          </w:p>
+        </w:tc>
+        <w:tc>
+          <w:tcPr>
+            <w:tcW w:type="dxa" w:w="1038"/>
+            <w:tcBorders>
+              <w:top w:val="single" w:color="999999" w:sz="4"/>
+              <w:left w:val="single" w:color="999999" w:sz="4"/>
+              <w:bottom w:val="single" w:color="999999" w:sz="4"/>
+              <w:right w:val="single" w:color="999999" w:sz="4"/>
+            </w:tcBorders>
+            <w:tcMar>
+              <w:top w:type="dxa" w:w="60"/>
+              <w:left w:type="dxa" w:w="90"/>
+              <w:bottom w:type="dxa" w:w="60"/>
+              <w:right w:type="dxa" w:w="90"/>
+            </w:tcMar>
+          </w:tcPr>
+          <w:p>
+            <w:pPr>
+              <w:jc w:val="center"/>
+            </w:pPr>
+            <w:r>
+              <w:rPr>
+                <w:rFonts w:ascii="Calibri" w:cs="Calibri" w:eastAsia="Calibri" w:hAnsi="Calibri"/>
+                <w:b w:val="false"/>
+                <w:bCs w:val="false"/>
+                <w:sz w:val="20"/>
+                <w:szCs w:val="20"/>
+              </w:rPr>
+              <w:t xml:space="preserve">+10%</w:t>
             </w:r>
           </w:p>
         </w:tc>
@@ -7197,52 +6835,6 @@
       <w:pPr>
         <w:spacing w:after="60"/>
       </w:pPr>
-    </w:p>
-    <w:p>
-      <w:pPr>
-        <w:spacing w:after="100"/>
-      </w:pPr>
-      <w:r>
-        <w:rPr>
-          <w:rFonts w:ascii="Calibri" w:cs="Calibri" w:eastAsia="Calibri" w:hAnsi="Calibri"/>
-          <w:b/>
-          <w:bCs/>
-          <w:sz w:val="22"/>
-          <w:szCs w:val="22"/>
-        </w:rPr>
-        <w:t xml:space="preserve">Si el K2 es de conejo: </w:t>
-      </w:r>
-      <w:r>
-        <w:rPr>
-          <w:rFonts w:ascii="Calibri" w:cs="Calibri" w:eastAsia="Calibri" w:hAnsi="Calibri"/>
-          <w:sz w:val="22"/>
-          <w:szCs w:val="22"/>
-        </w:rPr>
-        <w:t xml:space="preserve">anti-rabbit para 18 cristales → preparar 600 µL: 1,2 µL secundario + 598,8 µL BSA 1%. El anti-mouse se queda igual (400 µL).</w:t>
-      </w:r>
-    </w:p>
-    <w:p>
-      <w:pPr>
-        <w:spacing w:after="100"/>
-      </w:pPr>
-      <w:r>
-        <w:rPr>
-          <w:rFonts w:ascii="Calibri" w:cs="Calibri" w:eastAsia="Calibri" w:hAnsi="Calibri"/>
-          <w:b/>
-          <w:bCs/>
-          <w:sz w:val="22"/>
-          <w:szCs w:val="22"/>
-        </w:rPr>
-        <w:t xml:space="preserve">Si el K2 es de ratón: </w:t>
-      </w:r>
-      <w:r>
-        <w:rPr>
-          <w:rFonts w:ascii="Calibri" w:cs="Calibri" w:eastAsia="Calibri" w:hAnsi="Calibri"/>
-          <w:sz w:val="22"/>
-          <w:szCs w:val="22"/>
-        </w:rPr>
-        <w:t xml:space="preserve">anti-mouse para 12 cristales → preparar 480 µL: 1,2 µL secundario + 478,8 µL BSA 1%. El anti-rabbit se queda igual (500 µL).</w:t>
-      </w:r>
     </w:p>
     <w:p>
       <w:pPr>
@@ -7704,7 +7296,7 @@
                 <w:sz w:val="20"/>
                 <w:szCs w:val="20"/>
               </w:rPr>
-              <w:t xml:space="preserve">0,6 µL</w:t>
+              <w:t xml:space="preserve">0,54 µL</w:t>
             </w:r>
           </w:p>
         </w:tc>
@@ -7736,7 +7328,7 @@
                 <w:sz w:val="20"/>
                 <w:szCs w:val="20"/>
               </w:rPr>
-              <w:t xml:space="preserve">149,4 µL BSA 3%</w:t>
+              <w:t xml:space="preserve">134,5 µL BSA 3%</w:t>
             </w:r>
           </w:p>
         </w:tc>
@@ -7770,7 +7362,7 @@
                 <w:sz w:val="20"/>
                 <w:szCs w:val="20"/>
               </w:rPr>
-              <w:t xml:space="preserve">K10 (DE-K10) 1:200</w:t>
+              <w:t xml:space="preserve">K10 (DE-K10) 1:100</w:t>
             </w:r>
           </w:p>
         </w:tc>
@@ -7802,7 +7394,7 @@
                 <w:sz w:val="20"/>
                 <w:szCs w:val="20"/>
               </w:rPr>
-              <w:t xml:space="preserve">1 µL</w:t>
+              <w:t xml:space="preserve">2 µL</w:t>
             </w:r>
           </w:p>
         </w:tc>
@@ -7834,7 +7426,7 @@
                 <w:sz w:val="20"/>
                 <w:szCs w:val="20"/>
               </w:rPr>
-              <w:t xml:space="preserve">199 µL BSA 3%</w:t>
+              <w:t xml:space="preserve">198 µL BSA 3%</w:t>
             </w:r>
           </w:p>
         </w:tc>
@@ -7868,7 +7460,7 @@
                 <w:sz w:val="20"/>
                 <w:szCs w:val="20"/>
               </w:rPr>
-              <w:t xml:space="preserve">K2 [?]</w:t>
+              <w:t xml:space="preserve">K2 (NBP1-31423) 1:250</w:t>
             </w:r>
           </w:p>
         </w:tc>
@@ -7900,7 +7492,7 @@
                 <w:sz w:val="20"/>
                 <w:szCs w:val="20"/>
               </w:rPr>
-              <w:t xml:space="preserve">ver tabla K2</w:t>
+              <w:t xml:space="preserve">0,54 µL</w:t>
             </w:r>
           </w:p>
         </w:tc>
@@ -7932,7 +7524,7 @@
                 <w:sz w:val="20"/>
                 <w:szCs w:val="20"/>
               </w:rPr>
-              <w:t xml:space="preserve">BSA 3%</w:t>
+              <w:t xml:space="preserve">134,5 µL BSA 3%</w:t>
             </w:r>
           </w:p>
         </w:tc>
@@ -7998,7 +7590,7 @@
                 <w:sz w:val="20"/>
                 <w:szCs w:val="20"/>
               </w:rPr>
-              <w:t xml:space="preserve">1 µL (1,2 µL si K2 rabbit)</w:t>
+              <w:t xml:space="preserve">1,2 µL</w:t>
             </w:r>
           </w:p>
         </w:tc>
@@ -8030,7 +7622,7 @@
                 <w:sz w:val="20"/>
                 <w:szCs w:val="20"/>
               </w:rPr>
-              <w:t xml:space="preserve">499 µL (598,8 µL) BSA 1%</w:t>
+              <w:t xml:space="preserve">598,8 µL BSA 1%</w:t>
             </w:r>
           </w:p>
         </w:tc>
@@ -8096,7 +7688,7 @@
                 <w:sz w:val="20"/>
                 <w:szCs w:val="20"/>
               </w:rPr>
-              <w:t xml:space="preserve">1 µL (1,2 µL si K2 mouse)</w:t>
+              <w:t xml:space="preserve">0,66 µL</w:t>
             </w:r>
           </w:p>
         </w:tc>
@@ -8128,7 +7720,7 @@
                 <w:sz w:val="20"/>
                 <w:szCs w:val="20"/>
               </w:rPr>
-              <w:t xml:space="preserve">399 µL (478,8 µL) BSA 1%</w:t>
+              <w:t xml:space="preserve">263,3 µL BSA 1%</w:t>
             </w:r>
           </w:p>
         </w:tc>

</xml_diff>

<commit_message>
Protocolo IF: añadir especie (mouse/rabbit) al resumen de pipeteo
Co-Authored-By: Claude Opus 5.5 <noreply@anthropic.com>
Claude-Session: https://claude.ai/code/session_01Y6a6CQ6f4Dadxpc9Vpo6rH
</commit_message>
<xml_diff>
--- a/protocolos/IF_KerCT_queratinas_ND_D.docx
+++ b/protocolos/IF_KerCT_queratinas_ND_D.docx
@@ -6934,14 +6934,15 @@
         </w:tblBorders>
       </w:tblPr>
       <w:tblGrid>
-        <w:gridCol w:w="3200"/>
-        <w:gridCol w:w="3200"/>
-        <w:gridCol w:w="3238"/>
+        <w:gridCol w:w="2900"/>
+        <w:gridCol w:w="1900"/>
+        <w:gridCol w:w="2300"/>
+        <w:gridCol w:w="2538"/>
       </w:tblGrid>
       <w:tr>
         <w:tc>
           <w:tcPr>
-            <w:tcW w:type="dxa" w:w="3200"/>
+            <w:tcW w:type="dxa" w:w="2900"/>
             <w:tcBorders>
               <w:top w:val="single" w:color="999999" w:sz="4"/>
               <w:left w:val="single" w:color="999999" w:sz="4"/>
@@ -6974,7 +6975,7 @@
         </w:tc>
         <w:tc>
           <w:tcPr>
-            <w:tcW w:type="dxa" w:w="3200"/>
+            <w:tcW w:type="dxa" w:w="1900"/>
             <w:tcBorders>
               <w:top w:val="single" w:color="999999" w:sz="4"/>
               <w:left w:val="single" w:color="999999" w:sz="4"/>
@@ -7001,13 +7002,13 @@
                 <w:sz w:val="20"/>
                 <w:szCs w:val="20"/>
               </w:rPr>
-              <w:t xml:space="preserve">Anticuerpo</w:t>
-            </w:r>
-          </w:p>
-        </w:tc>
-        <w:tc>
-          <w:tcPr>
-            <w:tcW w:type="dxa" w:w="3238"/>
+              <w:t xml:space="preserve">Especie</w:t>
+            </w:r>
+          </w:p>
+        </w:tc>
+        <w:tc>
+          <w:tcPr>
+            <w:tcW w:type="dxa" w:w="2300"/>
             <w:tcBorders>
               <w:top w:val="single" w:color="999999" w:sz="4"/>
               <w:left w:val="single" w:color="999999" w:sz="4"/>
@@ -7034,6 +7035,39 @@
                 <w:sz w:val="20"/>
                 <w:szCs w:val="20"/>
               </w:rPr>
+              <w:t xml:space="preserve">Anticuerpo</w:t>
+            </w:r>
+          </w:p>
+        </w:tc>
+        <w:tc>
+          <w:tcPr>
+            <w:tcW w:type="dxa" w:w="2538"/>
+            <w:tcBorders>
+              <w:top w:val="single" w:color="999999" w:sz="4"/>
+              <w:left w:val="single" w:color="999999" w:sz="4"/>
+              <w:bottom w:val="single" w:color="999999" w:sz="4"/>
+              <w:right w:val="single" w:color="999999" w:sz="4"/>
+            </w:tcBorders>
+            <w:shd w:fill="D9E2F3" w:color="auto" w:val="clear"/>
+            <w:tcMar>
+              <w:top w:type="dxa" w:w="60"/>
+              <w:left w:type="dxa" w:w="90"/>
+              <w:bottom w:type="dxa" w:w="60"/>
+              <w:right w:type="dxa" w:w="90"/>
+            </w:tcMar>
+          </w:tcPr>
+          <w:p>
+            <w:pPr>
+              <w:jc w:val="center"/>
+            </w:pPr>
+            <w:r>
+              <w:rPr>
+                <w:rFonts w:ascii="Calibri" w:cs="Calibri" w:eastAsia="Calibri" w:hAnsi="Calibri"/>
+                <w:b/>
+                <w:bCs/>
+                <w:sz w:val="20"/>
+                <w:szCs w:val="20"/>
+              </w:rPr>
               <w:t xml:space="preserve">Diluyente</w:t>
             </w:r>
           </w:p>
@@ -7042,7 +7076,7 @@
       <w:tr>
         <w:tc>
           <w:tcPr>
-            <w:tcW w:type="dxa" w:w="3200"/>
+            <w:tcW w:type="dxa" w:w="2900"/>
             <w:tcBorders>
               <w:top w:val="single" w:color="999999" w:sz="4"/>
               <w:left w:val="single" w:color="999999" w:sz="4"/>
@@ -7074,7 +7108,39 @@
         </w:tc>
         <w:tc>
           <w:tcPr>
-            <w:tcW w:type="dxa" w:w="3200"/>
+            <w:tcW w:type="dxa" w:w="1900"/>
+            <w:tcBorders>
+              <w:top w:val="single" w:color="999999" w:sz="4"/>
+              <w:left w:val="single" w:color="999999" w:sz="4"/>
+              <w:bottom w:val="single" w:color="999999" w:sz="4"/>
+              <w:right w:val="single" w:color="999999" w:sz="4"/>
+            </w:tcBorders>
+            <w:tcMar>
+              <w:top w:type="dxa" w:w="60"/>
+              <w:left w:type="dxa" w:w="90"/>
+              <w:bottom w:type="dxa" w:w="60"/>
+              <w:right w:type="dxa" w:w="90"/>
+            </w:tcMar>
+          </w:tcPr>
+          <w:p>
+            <w:pPr>
+              <w:jc w:val="center"/>
+            </w:pPr>
+            <w:r>
+              <w:rPr>
+                <w:rFonts w:ascii="Calibri" w:cs="Calibri" w:eastAsia="Calibri" w:hAnsi="Calibri"/>
+                <w:b w:val="false"/>
+                <w:bCs w:val="false"/>
+                <w:sz w:val="20"/>
+                <w:szCs w:val="20"/>
+              </w:rPr>
+              <w:t xml:space="preserve">RABBIT (conejo)</w:t>
+            </w:r>
+          </w:p>
+        </w:tc>
+        <w:tc>
+          <w:tcPr>
+            <w:tcW w:type="dxa" w:w="2300"/>
             <w:tcBorders>
               <w:top w:val="single" w:color="999999" w:sz="4"/>
               <w:left w:val="single" w:color="999999" w:sz="4"/>
@@ -7106,7 +7172,7 @@
         </w:tc>
         <w:tc>
           <w:tcPr>
-            <w:tcW w:type="dxa" w:w="3238"/>
+            <w:tcW w:type="dxa" w:w="2538"/>
             <w:tcBorders>
               <w:top w:val="single" w:color="999999" w:sz="4"/>
               <w:left w:val="single" w:color="999999" w:sz="4"/>
@@ -7140,7 +7206,7 @@
       <w:tr>
         <w:tc>
           <w:tcPr>
-            <w:tcW w:type="dxa" w:w="3200"/>
+            <w:tcW w:type="dxa" w:w="2900"/>
             <w:tcBorders>
               <w:top w:val="single" w:color="999999" w:sz="4"/>
               <w:left w:val="single" w:color="999999" w:sz="4"/>
@@ -7172,7 +7238,39 @@
         </w:tc>
         <w:tc>
           <w:tcPr>
-            <w:tcW w:type="dxa" w:w="3200"/>
+            <w:tcW w:type="dxa" w:w="1900"/>
+            <w:tcBorders>
+              <w:top w:val="single" w:color="999999" w:sz="4"/>
+              <w:left w:val="single" w:color="999999" w:sz="4"/>
+              <w:bottom w:val="single" w:color="999999" w:sz="4"/>
+              <w:right w:val="single" w:color="999999" w:sz="4"/>
+            </w:tcBorders>
+            <w:tcMar>
+              <w:top w:type="dxa" w:w="60"/>
+              <w:left w:type="dxa" w:w="90"/>
+              <w:bottom w:type="dxa" w:w="60"/>
+              <w:right w:type="dxa" w:w="90"/>
+            </w:tcMar>
+          </w:tcPr>
+          <w:p>
+            <w:pPr>
+              <w:jc w:val="center"/>
+            </w:pPr>
+            <w:r>
+              <w:rPr>
+                <w:rFonts w:ascii="Calibri" w:cs="Calibri" w:eastAsia="Calibri" w:hAnsi="Calibri"/>
+                <w:b w:val="false"/>
+                <w:bCs w:val="false"/>
+                <w:sz w:val="20"/>
+                <w:szCs w:val="20"/>
+              </w:rPr>
+              <w:t xml:space="preserve">RABBIT (conejo)</w:t>
+            </w:r>
+          </w:p>
+        </w:tc>
+        <w:tc>
+          <w:tcPr>
+            <w:tcW w:type="dxa" w:w="2300"/>
             <w:tcBorders>
               <w:top w:val="single" w:color="999999" w:sz="4"/>
               <w:left w:val="single" w:color="999999" w:sz="4"/>
@@ -7204,7 +7302,7 @@
         </w:tc>
         <w:tc>
           <w:tcPr>
-            <w:tcW w:type="dxa" w:w="3238"/>
+            <w:tcW w:type="dxa" w:w="2538"/>
             <w:tcBorders>
               <w:top w:val="single" w:color="999999" w:sz="4"/>
               <w:left w:val="single" w:color="999999" w:sz="4"/>
@@ -7238,7 +7336,7 @@
       <w:tr>
         <w:tc>
           <w:tcPr>
-            <w:tcW w:type="dxa" w:w="3200"/>
+            <w:tcW w:type="dxa" w:w="2900"/>
             <w:tcBorders>
               <w:top w:val="single" w:color="999999" w:sz="4"/>
               <w:left w:val="single" w:color="999999" w:sz="4"/>
@@ -7270,7 +7368,39 @@
         </w:tc>
         <w:tc>
           <w:tcPr>
-            <w:tcW w:type="dxa" w:w="3200"/>
+            <w:tcW w:type="dxa" w:w="1900"/>
+            <w:tcBorders>
+              <w:top w:val="single" w:color="999999" w:sz="4"/>
+              <w:left w:val="single" w:color="999999" w:sz="4"/>
+              <w:bottom w:val="single" w:color="999999" w:sz="4"/>
+              <w:right w:val="single" w:color="999999" w:sz="4"/>
+            </w:tcBorders>
+            <w:tcMar>
+              <w:top w:type="dxa" w:w="60"/>
+              <w:left w:type="dxa" w:w="90"/>
+              <w:bottom w:type="dxa" w:w="60"/>
+              <w:right w:type="dxa" w:w="90"/>
+            </w:tcMar>
+          </w:tcPr>
+          <w:p>
+            <w:pPr>
+              <w:jc w:val="center"/>
+            </w:pPr>
+            <w:r>
+              <w:rPr>
+                <w:rFonts w:ascii="Calibri" w:cs="Calibri" w:eastAsia="Calibri" w:hAnsi="Calibri"/>
+                <w:b w:val="false"/>
+                <w:bCs w:val="false"/>
+                <w:sz w:val="20"/>
+                <w:szCs w:val="20"/>
+              </w:rPr>
+              <w:t xml:space="preserve">RABBIT (conejo)</w:t>
+            </w:r>
+          </w:p>
+        </w:tc>
+        <w:tc>
+          <w:tcPr>
+            <w:tcW w:type="dxa" w:w="2300"/>
             <w:tcBorders>
               <w:top w:val="single" w:color="999999" w:sz="4"/>
               <w:left w:val="single" w:color="999999" w:sz="4"/>
@@ -7302,7 +7432,7 @@
         </w:tc>
         <w:tc>
           <w:tcPr>
-            <w:tcW w:type="dxa" w:w="3238"/>
+            <w:tcW w:type="dxa" w:w="2538"/>
             <w:tcBorders>
               <w:top w:val="single" w:color="999999" w:sz="4"/>
               <w:left w:val="single" w:color="999999" w:sz="4"/>
@@ -7336,7 +7466,7 @@
       <w:tr>
         <w:tc>
           <w:tcPr>
-            <w:tcW w:type="dxa" w:w="3200"/>
+            <w:tcW w:type="dxa" w:w="2900"/>
             <w:tcBorders>
               <w:top w:val="single" w:color="999999" w:sz="4"/>
               <w:left w:val="single" w:color="999999" w:sz="4"/>
@@ -7368,7 +7498,39 @@
         </w:tc>
         <w:tc>
           <w:tcPr>
-            <w:tcW w:type="dxa" w:w="3200"/>
+            <w:tcW w:type="dxa" w:w="1900"/>
+            <w:tcBorders>
+              <w:top w:val="single" w:color="999999" w:sz="4"/>
+              <w:left w:val="single" w:color="999999" w:sz="4"/>
+              <w:bottom w:val="single" w:color="999999" w:sz="4"/>
+              <w:right w:val="single" w:color="999999" w:sz="4"/>
+            </w:tcBorders>
+            <w:tcMar>
+              <w:top w:type="dxa" w:w="60"/>
+              <w:left w:type="dxa" w:w="90"/>
+              <w:bottom w:type="dxa" w:w="60"/>
+              <w:right w:type="dxa" w:w="90"/>
+            </w:tcMar>
+          </w:tcPr>
+          <w:p>
+            <w:pPr>
+              <w:jc w:val="center"/>
+            </w:pPr>
+            <w:r>
+              <w:rPr>
+                <w:rFonts w:ascii="Calibri" w:cs="Calibri" w:eastAsia="Calibri" w:hAnsi="Calibri"/>
+                <w:b w:val="false"/>
+                <w:bCs w:val="false"/>
+                <w:sz w:val="20"/>
+                <w:szCs w:val="20"/>
+              </w:rPr>
+              <w:t xml:space="preserve">MOUSE (ratón)</w:t>
+            </w:r>
+          </w:p>
+        </w:tc>
+        <w:tc>
+          <w:tcPr>
+            <w:tcW w:type="dxa" w:w="2300"/>
             <w:tcBorders>
               <w:top w:val="single" w:color="999999" w:sz="4"/>
               <w:left w:val="single" w:color="999999" w:sz="4"/>
@@ -7400,7 +7562,7 @@
         </w:tc>
         <w:tc>
           <w:tcPr>
-            <w:tcW w:type="dxa" w:w="3238"/>
+            <w:tcW w:type="dxa" w:w="2538"/>
             <w:tcBorders>
               <w:top w:val="single" w:color="999999" w:sz="4"/>
               <w:left w:val="single" w:color="999999" w:sz="4"/>
@@ -7434,7 +7596,7 @@
       <w:tr>
         <w:tc>
           <w:tcPr>
-            <w:tcW w:type="dxa" w:w="3200"/>
+            <w:tcW w:type="dxa" w:w="2900"/>
             <w:tcBorders>
               <w:top w:val="single" w:color="999999" w:sz="4"/>
               <w:left w:val="single" w:color="999999" w:sz="4"/>
@@ -7466,7 +7628,39 @@
         </w:tc>
         <w:tc>
           <w:tcPr>
-            <w:tcW w:type="dxa" w:w="3200"/>
+            <w:tcW w:type="dxa" w:w="1900"/>
+            <w:tcBorders>
+              <w:top w:val="single" w:color="999999" w:sz="4"/>
+              <w:left w:val="single" w:color="999999" w:sz="4"/>
+              <w:bottom w:val="single" w:color="999999" w:sz="4"/>
+              <w:right w:val="single" w:color="999999" w:sz="4"/>
+            </w:tcBorders>
+            <w:tcMar>
+              <w:top w:type="dxa" w:w="60"/>
+              <w:left w:type="dxa" w:w="90"/>
+              <w:bottom w:type="dxa" w:w="60"/>
+              <w:right w:type="dxa" w:w="90"/>
+            </w:tcMar>
+          </w:tcPr>
+          <w:p>
+            <w:pPr>
+              <w:jc w:val="center"/>
+            </w:pPr>
+            <w:r>
+              <w:rPr>
+                <w:rFonts w:ascii="Calibri" w:cs="Calibri" w:eastAsia="Calibri" w:hAnsi="Calibri"/>
+                <w:b w:val="false"/>
+                <w:bCs w:val="false"/>
+                <w:sz w:val="20"/>
+                <w:szCs w:val="20"/>
+              </w:rPr>
+              <w:t xml:space="preserve">RABBIT (conejo)</w:t>
+            </w:r>
+          </w:p>
+        </w:tc>
+        <w:tc>
+          <w:tcPr>
+            <w:tcW w:type="dxa" w:w="2300"/>
             <w:tcBorders>
               <w:top w:val="single" w:color="999999" w:sz="4"/>
               <w:left w:val="single" w:color="999999" w:sz="4"/>
@@ -7498,7 +7692,7 @@
         </w:tc>
         <w:tc>
           <w:tcPr>
-            <w:tcW w:type="dxa" w:w="3238"/>
+            <w:tcW w:type="dxa" w:w="2538"/>
             <w:tcBorders>
               <w:top w:val="single" w:color="999999" w:sz="4"/>
               <w:left w:val="single" w:color="999999" w:sz="4"/>
@@ -7532,7 +7726,7 @@
       <w:tr>
         <w:tc>
           <w:tcPr>
-            <w:tcW w:type="dxa" w:w="3200"/>
+            <w:tcW w:type="dxa" w:w="2900"/>
             <w:tcBorders>
               <w:top w:val="single" w:color="999999" w:sz="4"/>
               <w:left w:val="single" w:color="999999" w:sz="4"/>
@@ -7564,7 +7758,39 @@
         </w:tc>
         <w:tc>
           <w:tcPr>
-            <w:tcW w:type="dxa" w:w="3200"/>
+            <w:tcW w:type="dxa" w:w="1900"/>
+            <w:tcBorders>
+              <w:top w:val="single" w:color="999999" w:sz="4"/>
+              <w:left w:val="single" w:color="999999" w:sz="4"/>
+              <w:bottom w:val="single" w:color="999999" w:sz="4"/>
+              <w:right w:val="single" w:color="999999" w:sz="4"/>
+            </w:tcBorders>
+            <w:tcMar>
+              <w:top w:type="dxa" w:w="60"/>
+              <w:left w:type="dxa" w:w="90"/>
+              <w:bottom w:type="dxa" w:w="60"/>
+              <w:right w:type="dxa" w:w="90"/>
+            </w:tcMar>
+          </w:tcPr>
+          <w:p>
+            <w:pPr>
+              <w:jc w:val="center"/>
+            </w:pPr>
+            <w:r>
+              <w:rPr>
+                <w:rFonts w:ascii="Calibri" w:cs="Calibri" w:eastAsia="Calibri" w:hAnsi="Calibri"/>
+                <w:b w:val="false"/>
+                <w:bCs w:val="false"/>
+                <w:sz w:val="20"/>
+                <w:szCs w:val="20"/>
+              </w:rPr>
+              <w:t xml:space="preserve">Goat anti-rabbit → K1, K2, K5, K14</w:t>
+            </w:r>
+          </w:p>
+        </w:tc>
+        <w:tc>
+          <w:tcPr>
+            <w:tcW w:type="dxa" w:w="2300"/>
             <w:tcBorders>
               <w:top w:val="single" w:color="999999" w:sz="4"/>
               <w:left w:val="single" w:color="999999" w:sz="4"/>
@@ -7596,7 +7822,7 @@
         </w:tc>
         <w:tc>
           <w:tcPr>
-            <w:tcW w:type="dxa" w:w="3238"/>
+            <w:tcW w:type="dxa" w:w="2538"/>
             <w:tcBorders>
               <w:top w:val="single" w:color="999999" w:sz="4"/>
               <w:left w:val="single" w:color="999999" w:sz="4"/>
@@ -7630,7 +7856,7 @@
       <w:tr>
         <w:tc>
           <w:tcPr>
-            <w:tcW w:type="dxa" w:w="3200"/>
+            <w:tcW w:type="dxa" w:w="2900"/>
             <w:tcBorders>
               <w:top w:val="single" w:color="999999" w:sz="4"/>
               <w:left w:val="single" w:color="999999" w:sz="4"/>
@@ -7662,7 +7888,39 @@
         </w:tc>
         <w:tc>
           <w:tcPr>
-            <w:tcW w:type="dxa" w:w="3200"/>
+            <w:tcW w:type="dxa" w:w="1900"/>
+            <w:tcBorders>
+              <w:top w:val="single" w:color="999999" w:sz="4"/>
+              <w:left w:val="single" w:color="999999" w:sz="4"/>
+              <w:bottom w:val="single" w:color="999999" w:sz="4"/>
+              <w:right w:val="single" w:color="999999" w:sz="4"/>
+            </w:tcBorders>
+            <w:tcMar>
+              <w:top w:type="dxa" w:w="60"/>
+              <w:left w:type="dxa" w:w="90"/>
+              <w:bottom w:type="dxa" w:w="60"/>
+              <w:right w:type="dxa" w:w="90"/>
+            </w:tcMar>
+          </w:tcPr>
+          <w:p>
+            <w:pPr>
+              <w:jc w:val="center"/>
+            </w:pPr>
+            <w:r>
+              <w:rPr>
+                <w:rFonts w:ascii="Calibri" w:cs="Calibri" w:eastAsia="Calibri" w:hAnsi="Calibri"/>
+                <w:b w:val="false"/>
+                <w:bCs w:val="false"/>
+                <w:sz w:val="20"/>
+                <w:szCs w:val="20"/>
+              </w:rPr>
+              <w:t xml:space="preserve">Anti-mouse → solo K10</w:t>
+            </w:r>
+          </w:p>
+        </w:tc>
+        <w:tc>
+          <w:tcPr>
+            <w:tcW w:type="dxa" w:w="2300"/>
             <w:tcBorders>
               <w:top w:val="single" w:color="999999" w:sz="4"/>
               <w:left w:val="single" w:color="999999" w:sz="4"/>
@@ -7694,7 +7952,7 @@
         </w:tc>
         <w:tc>
           <w:tcPr>
-            <w:tcW w:type="dxa" w:w="3238"/>
+            <w:tcW w:type="dxa" w:w="2538"/>
             <w:tcBorders>
               <w:top w:val="single" w:color="999999" w:sz="4"/>
               <w:left w:val="single" w:color="999999" w:sz="4"/>
@@ -7728,7 +7986,7 @@
       <w:tr>
         <w:tc>
           <w:tcPr>
-            <w:tcW w:type="dxa" w:w="3200"/>
+            <w:tcW w:type="dxa" w:w="2900"/>
             <w:tcBorders>
               <w:top w:val="single" w:color="999999" w:sz="4"/>
               <w:left w:val="single" w:color="999999" w:sz="4"/>
@@ -7760,7 +8018,39 @@
         </w:tc>
         <w:tc>
           <w:tcPr>
-            <w:tcW w:type="dxa" w:w="3200"/>
+            <w:tcW w:type="dxa" w:w="1900"/>
+            <w:tcBorders>
+              <w:top w:val="single" w:color="999999" w:sz="4"/>
+              <w:left w:val="single" w:color="999999" w:sz="4"/>
+              <w:bottom w:val="single" w:color="999999" w:sz="4"/>
+              <w:right w:val="single" w:color="999999" w:sz="4"/>
+            </w:tcBorders>
+            <w:tcMar>
+              <w:top w:type="dxa" w:w="60"/>
+              <w:left w:type="dxa" w:w="90"/>
+              <w:bottom w:type="dxa" w:w="60"/>
+              <w:right w:type="dxa" w:w="90"/>
+            </w:tcMar>
+          </w:tcPr>
+          <w:p>
+            <w:pPr>
+              <w:jc w:val="center"/>
+            </w:pPr>
+            <w:r>
+              <w:rPr>
+                <w:rFonts w:ascii="Calibri" w:cs="Calibri" w:eastAsia="Calibri" w:hAnsi="Calibri"/>
+                <w:b w:val="false"/>
+                <w:bCs w:val="false"/>
+                <w:sz w:val="20"/>
+                <w:szCs w:val="20"/>
+              </w:rPr>
+              <w:t xml:space="preserve">—</w:t>
+            </w:r>
+          </w:p>
+        </w:tc>
+        <w:tc>
+          <w:tcPr>
+            <w:tcW w:type="dxa" w:w="2300"/>
             <w:tcBorders>
               <w:top w:val="single" w:color="999999" w:sz="4"/>
               <w:left w:val="single" w:color="999999" w:sz="4"/>
@@ -7792,7 +8082,7 @@
         </w:tc>
         <w:tc>
           <w:tcPr>
-            <w:tcW w:type="dxa" w:w="3238"/>
+            <w:tcW w:type="dxa" w:w="2538"/>
             <w:tcBorders>
               <w:top w:val="single" w:color="999999" w:sz="4"/>
               <w:left w:val="single" w:color="999999" w:sz="4"/>

</xml_diff>

<commit_message>
Protocolo IF: K2 a 1:200
Co-Authored-By: Claude Opus 5.5 <noreply@anthropic.com>
Claude-Session: https://claude.ai/code/session_01Y6a6CQ6f4Dadxpc9Vpo6rH
</commit_message>
<xml_diff>
--- a/protocolos/IF_KerCT_queratinas_ND_D.docx
+++ b/protocolos/IF_KerCT_queratinas_ND_D.docx
@@ -1851,7 +1851,7 @@
                 <w:sz w:val="20"/>
                 <w:szCs w:val="20"/>
               </w:rPr>
-              <w:t xml:space="preserve">1:250</w:t>
+              <w:t xml:space="preserve">1:200</w:t>
             </w:r>
           </w:p>
         </w:tc>
@@ -2942,7 +2942,7 @@
           <w:sz w:val="22"/>
           <w:szCs w:val="22"/>
         </w:rPr>
-        <w:t xml:space="preserve">K2 (NBP1-31423, policlonal de conejo): no está en el TFG. El fabricante da 1:100-1:1000 para ICC/IF; se usa 1:250 (como K14), tirando a concentrado porque K2 es de diferenciación tardía y puede estar baja. Si da mucho fondo, probar 1:500. La concentración varía por lote: mirar la etiqueta del vial.</w:t>
+        <w:t xml:space="preserve">K2 (NBP1-31423, policlonal de conejo): no está en el TFG. El fabricante da 1:100-1:1000 para ICC/IF; se usa 1:200. La concentración varía por lote: mirar la etiqueta del vial.</w:t>
       </w:r>
     </w:p>
     <w:p>
@@ -4979,7 +4979,7 @@
                 <w:sz w:val="20"/>
                 <w:szCs w:val="20"/>
               </w:rPr>
-              <w:t xml:space="preserve">1:250</w:t>
+              <w:t xml:space="preserve">1:200</w:t>
             </w:r>
           </w:p>
         </w:tc>
@@ -5075,7 +5075,7 @@
                 <w:sz w:val="20"/>
                 <w:szCs w:val="20"/>
               </w:rPr>
-              <w:t xml:space="preserve">135 µL</w:t>
+              <w:t xml:space="preserve">132 µL</w:t>
             </w:r>
           </w:p>
         </w:tc>
@@ -5107,7 +5107,7 @@
                 <w:sz w:val="20"/>
                 <w:szCs w:val="20"/>
               </w:rPr>
-              <w:t xml:space="preserve">0,54 µL + 134,5 µL</w:t>
+              <w:t xml:space="preserve">0,66 µL + 131,3 µL</w:t>
             </w:r>
           </w:p>
         </w:tc>
@@ -5139,7 +5139,7 @@
                 <w:sz w:val="20"/>
                 <w:szCs w:val="20"/>
               </w:rPr>
-              <w:t xml:space="preserve">+12%</w:t>
+              <w:t xml:space="preserve">+10%</w:t>
             </w:r>
           </w:p>
         </w:tc>
@@ -7622,7 +7622,7 @@
                 <w:sz w:val="20"/>
                 <w:szCs w:val="20"/>
               </w:rPr>
-              <w:t xml:space="preserve">K2 (NBP1-31423) 1:250</w:t>
+              <w:t xml:space="preserve">K2 (NBP1-31423) 1:200</w:t>
             </w:r>
           </w:p>
         </w:tc>
@@ -7686,7 +7686,7 @@
                 <w:sz w:val="20"/>
                 <w:szCs w:val="20"/>
               </w:rPr>
-              <w:t xml:space="preserve">0,54 µL</w:t>
+              <w:t xml:space="preserve">0,66 µL</w:t>
             </w:r>
           </w:p>
         </w:tc>
@@ -7718,7 +7718,7 @@
                 <w:sz w:val="20"/>
                 <w:szCs w:val="20"/>
               </w:rPr>
-              <w:t xml:space="preserve">134,5 µL BSA 3%</w:t>
+              <w:t xml:space="preserve">131,3 µL BSA 3%</w:t>
             </w:r>
           </w:p>
         </w:tc>

</xml_diff>